<commit_message>
docs: add insights chart illustration and ensure all sections have illustrations
</commit_message>
<xml_diff>
--- a/docs/ProjectPulse_Functional_Specification.docx
+++ b/docs/ProjectPulse_Functional_Specification.docx
@@ -17880,11 +17880,11 @@
               <a:graphicData uri="http://schemas.openxmlformats.org/drawingml/2006/picture">
                 <pic:pic>
                   <pic:nvPicPr>
-                    <pic:cNvPr id="0" name="05_raid_register.png"/>
+                    <pic:cNvPr id="0" name="04_weekly_scheduler.png"/>
                     <pic:cNvPicPr/>
                   </pic:nvPicPr>
                   <pic:blipFill>
-                    <a:blip r:embed="rId14"/>
+                    <a:blip r:embed="rId13"/>
                     <a:stretch>
                       <a:fillRect/>
                     </a:stretch>
@@ -19765,7 +19765,7 @@
                     <pic:cNvPicPr/>
                   </pic:nvPicPr>
                   <pic:blipFill>
-                    <a:blip r:embed="rId15"/>
+                    <a:blip r:embed="rId14"/>
                     <a:stretch>
                       <a:fillRect/>
                     </a:stretch>
@@ -20455,6 +20455,1329 @@
                 <pic:pic>
                   <pic:nvPicPr>
                     <pic:cNvPr id="0" name="07_defect_tracker.png"/>
+                    <pic:cNvPicPr/>
+                  </pic:nvPicPr>
+                  <pic:blipFill>
+                    <a:blip r:embed="rId15"/>
+                    <a:stretch>
+                      <a:fillRect/>
+                    </a:stretch>
+                  </pic:blipFill>
+                  <pic:spPr>
+                    <a:xfrm>
+                      <a:off x="0" y="0"/>
+                      <a:ext cx="5760720" cy="3240405"/>
+                    </a:xfrm>
+                    <a:prstGeom prst="rect"/>
+                  </pic:spPr>
+                </pic:pic>
+              </a:graphicData>
+            </a:graphic>
+          </wp:inline>
+        </w:drawing>
+      </w:r>
+    </w:p>
+    <w:p>
+      <w:pPr>
+        <w:spacing w:before="80" w:after="280"/>
+        <w:jc w:val="center"/>
+      </w:pPr>
+      <w:r>
+        <w:rPr>
+          <w:i/>
+          <w:color w:val="6C757D"/>
+          <w:sz w:val="18"/>
+        </w:rPr>
+        <w:t>Figure 13.1 — Defect Tracker: severity cards, defect register, and lifecycle workflow</w:t>
+      </w:r>
+    </w:p>
+    <w:p>
+      <w:pPr>
+        <w:pStyle w:val="Heading2"/>
+        <w:spacing w:before="360" w:after="120"/>
+      </w:pPr>
+      <w:r>
+        <w:rPr>
+          <w:color w:val="1E9ED5"/>
+        </w:rPr>
+        <w:t>13.1  Severity Matrix &amp; SLA Targets</w:t>
+      </w:r>
+    </w:p>
+    <w:tbl>
+      <w:tblPr>
+        <w:tblStyle w:val="TableGrid"/>
+        <w:tblW w:type="auto" w:w="0"/>
+        <w:jc w:val="center"/>
+        <w:tblLook w:firstColumn="1" w:firstRow="1" w:lastColumn="0" w:lastRow="0" w:noHBand="0" w:noVBand="1" w:val="04A0"/>
+      </w:tblPr>
+      <w:tblGrid>
+        <w:gridCol w:w="1814"/>
+        <w:gridCol w:w="1814"/>
+        <w:gridCol w:w="1814"/>
+        <w:gridCol w:w="1814"/>
+        <w:gridCol w:w="1814"/>
+      </w:tblGrid>
+      <w:tr>
+        <w:tc>
+          <w:tcPr>
+            <w:tcW w:type="dxa" w:w="1584"/>
+            <w:shd w:val="clear" w:color="auto" w:fill="0D1B2A"/>
+          </w:tcPr>
+          <w:p>
+            <w:pPr>
+              <w:jc w:val="center"/>
+            </w:pPr>
+            <w:r>
+              <w:rPr>
+                <w:b/>
+                <w:color w:val="FFFFFF"/>
+                <w:sz w:val="19"/>
+              </w:rPr>
+              <w:t>Severity</w:t>
+            </w:r>
+          </w:p>
+        </w:tc>
+        <w:tc>
+          <w:tcPr>
+            <w:tcW w:type="dxa" w:w="864"/>
+            <w:shd w:val="clear" w:color="auto" w:fill="0D1B2A"/>
+          </w:tcPr>
+          <w:p>
+            <w:pPr>
+              <w:jc w:val="center"/>
+            </w:pPr>
+            <w:r>
+              <w:rPr>
+                <w:b/>
+                <w:color w:val="FFFFFF"/>
+                <w:sz w:val="19"/>
+              </w:rPr>
+              <w:t>Code</w:t>
+            </w:r>
+          </w:p>
+        </w:tc>
+        <w:tc>
+          <w:tcPr>
+            <w:tcW w:type="dxa" w:w="3312"/>
+            <w:shd w:val="clear" w:color="auto" w:fill="0D1B2A"/>
+          </w:tcPr>
+          <w:p>
+            <w:pPr>
+              <w:jc w:val="center"/>
+            </w:pPr>
+            <w:r>
+              <w:rPr>
+                <w:b/>
+                <w:color w:val="FFFFFF"/>
+                <w:sz w:val="19"/>
+              </w:rPr>
+              <w:t>Definition</w:t>
+            </w:r>
+          </w:p>
+        </w:tc>
+        <w:tc>
+          <w:tcPr>
+            <w:tcW w:type="dxa" w:w="2304"/>
+            <w:shd w:val="clear" w:color="auto" w:fill="0D1B2A"/>
+          </w:tcPr>
+          <w:p>
+            <w:pPr>
+              <w:jc w:val="center"/>
+            </w:pPr>
+            <w:r>
+              <w:rPr>
+                <w:b/>
+                <w:color w:val="FFFFFF"/>
+                <w:sz w:val="19"/>
+              </w:rPr>
+              <w:t>Health Index Impact</w:t>
+            </w:r>
+          </w:p>
+        </w:tc>
+        <w:tc>
+          <w:tcPr>
+            <w:tcW w:type="dxa" w:w="2016"/>
+            <w:shd w:val="clear" w:color="auto" w:fill="0D1B2A"/>
+          </w:tcPr>
+          <w:p>
+            <w:pPr>
+              <w:jc w:val="center"/>
+            </w:pPr>
+            <w:r>
+              <w:rPr>
+                <w:b/>
+                <w:color w:val="FFFFFF"/>
+                <w:sz w:val="19"/>
+              </w:rPr>
+              <w:t>SLA Target</w:t>
+            </w:r>
+          </w:p>
+        </w:tc>
+      </w:tr>
+      <w:tr>
+        <w:tc>
+          <w:tcPr>
+            <w:tcW w:type="dxa" w:w="1584"/>
+            <w:shd w:val="clear" w:color="auto" w:fill="F8F9FA"/>
+          </w:tcPr>
+          <w:p>
+            <w:pPr>
+              <w:spacing w:before="60" w:after="60"/>
+            </w:pPr>
+            <w:r>
+              <w:rPr>
+                <w:sz w:val="19"/>
+              </w:rPr>
+              <w:t>Blocker</w:t>
+            </w:r>
+          </w:p>
+        </w:tc>
+        <w:tc>
+          <w:tcPr>
+            <w:tcW w:type="dxa" w:w="864"/>
+            <w:shd w:val="clear" w:color="auto" w:fill="F8F9FA"/>
+          </w:tcPr>
+          <w:p>
+            <w:pPr>
+              <w:spacing w:before="60" w:after="60"/>
+            </w:pPr>
+            <w:r>
+              <w:rPr>
+                <w:sz w:val="19"/>
+              </w:rPr>
+              <w:t>S1</w:t>
+            </w:r>
+          </w:p>
+        </w:tc>
+        <w:tc>
+          <w:tcPr>
+            <w:tcW w:type="dxa" w:w="3312"/>
+            <w:shd w:val="clear" w:color="auto" w:fill="F8F9FA"/>
+          </w:tcPr>
+          <w:p>
+            <w:pPr>
+              <w:spacing w:before="60" w:after="60"/>
+            </w:pPr>
+            <w:r>
+              <w:rPr>
+                <w:sz w:val="19"/>
+              </w:rPr>
+              <w:t>Critical function completely broken. No workaround. Application unusable.</w:t>
+            </w:r>
+          </w:p>
+        </w:tc>
+        <w:tc>
+          <w:tcPr>
+            <w:tcW w:type="dxa" w:w="2304"/>
+            <w:shd w:val="clear" w:color="auto" w:fill="F8F9FA"/>
+          </w:tcPr>
+          <w:p>
+            <w:pPr>
+              <w:spacing w:before="60" w:after="60"/>
+            </w:pPr>
+            <w:r>
+              <w:rPr>
+                <w:sz w:val="19"/>
+              </w:rPr>
+              <w:t>-10% per active Blocker</w:t>
+            </w:r>
+          </w:p>
+        </w:tc>
+        <w:tc>
+          <w:tcPr>
+            <w:tcW w:type="dxa" w:w="2016"/>
+            <w:shd w:val="clear" w:color="auto" w:fill="F8F9FA"/>
+          </w:tcPr>
+          <w:p>
+            <w:pPr>
+              <w:spacing w:before="60" w:after="60"/>
+            </w:pPr>
+            <w:r>
+              <w:rPr>
+                <w:sz w:val="19"/>
+              </w:rPr>
+              <w:t>24 hours</w:t>
+            </w:r>
+          </w:p>
+        </w:tc>
+      </w:tr>
+      <w:tr>
+        <w:tc>
+          <w:tcPr>
+            <w:tcW w:type="dxa" w:w="1584"/>
+            <w:shd w:val="clear" w:color="auto" w:fill="FFFFFF"/>
+          </w:tcPr>
+          <w:p>
+            <w:pPr>
+              <w:spacing w:before="60" w:after="60"/>
+            </w:pPr>
+            <w:r>
+              <w:rPr>
+                <w:sz w:val="19"/>
+              </w:rPr>
+              <w:t>High</w:t>
+            </w:r>
+          </w:p>
+        </w:tc>
+        <w:tc>
+          <w:tcPr>
+            <w:tcW w:type="dxa" w:w="864"/>
+            <w:shd w:val="clear" w:color="auto" w:fill="FFFFFF"/>
+          </w:tcPr>
+          <w:p>
+            <w:pPr>
+              <w:spacing w:before="60" w:after="60"/>
+            </w:pPr>
+            <w:r>
+              <w:rPr>
+                <w:sz w:val="19"/>
+              </w:rPr>
+              <w:t>S2</w:t>
+            </w:r>
+          </w:p>
+        </w:tc>
+        <w:tc>
+          <w:tcPr>
+            <w:tcW w:type="dxa" w:w="3312"/>
+            <w:shd w:val="clear" w:color="auto" w:fill="FFFFFF"/>
+          </w:tcPr>
+          <w:p>
+            <w:pPr>
+              <w:spacing w:before="60" w:after="60"/>
+            </w:pPr>
+            <w:r>
+              <w:rPr>
+                <w:sz w:val="19"/>
+              </w:rPr>
+              <w:t>Major functionality impaired. Temporary workaround exists but is impractical.</w:t>
+            </w:r>
+          </w:p>
+        </w:tc>
+        <w:tc>
+          <w:tcPr>
+            <w:tcW w:type="dxa" w:w="2304"/>
+            <w:shd w:val="clear" w:color="auto" w:fill="FFFFFF"/>
+          </w:tcPr>
+          <w:p>
+            <w:pPr>
+              <w:spacing w:before="60" w:after="60"/>
+            </w:pPr>
+            <w:r>
+              <w:rPr>
+                <w:sz w:val="19"/>
+              </w:rPr>
+              <w:t>-5% per active High</w:t>
+            </w:r>
+          </w:p>
+        </w:tc>
+        <w:tc>
+          <w:tcPr>
+            <w:tcW w:type="dxa" w:w="2016"/>
+            <w:shd w:val="clear" w:color="auto" w:fill="FFFFFF"/>
+          </w:tcPr>
+          <w:p>
+            <w:pPr>
+              <w:spacing w:before="60" w:after="60"/>
+            </w:pPr>
+            <w:r>
+              <w:rPr>
+                <w:sz w:val="19"/>
+              </w:rPr>
+              <w:t>48 hours</w:t>
+            </w:r>
+          </w:p>
+        </w:tc>
+      </w:tr>
+      <w:tr>
+        <w:tc>
+          <w:tcPr>
+            <w:tcW w:type="dxa" w:w="1584"/>
+            <w:shd w:val="clear" w:color="auto" w:fill="F8F9FA"/>
+          </w:tcPr>
+          <w:p>
+            <w:pPr>
+              <w:spacing w:before="60" w:after="60"/>
+            </w:pPr>
+            <w:r>
+              <w:rPr>
+                <w:sz w:val="19"/>
+              </w:rPr>
+              <w:t>Medium</w:t>
+            </w:r>
+          </w:p>
+        </w:tc>
+        <w:tc>
+          <w:tcPr>
+            <w:tcW w:type="dxa" w:w="864"/>
+            <w:shd w:val="clear" w:color="auto" w:fill="F8F9FA"/>
+          </w:tcPr>
+          <w:p>
+            <w:pPr>
+              <w:spacing w:before="60" w:after="60"/>
+            </w:pPr>
+            <w:r>
+              <w:rPr>
+                <w:sz w:val="19"/>
+              </w:rPr>
+              <w:t>S3</w:t>
+            </w:r>
+          </w:p>
+        </w:tc>
+        <w:tc>
+          <w:tcPr>
+            <w:tcW w:type="dxa" w:w="3312"/>
+            <w:shd w:val="clear" w:color="auto" w:fill="F8F9FA"/>
+          </w:tcPr>
+          <w:p>
+            <w:pPr>
+              <w:spacing w:before="60" w:after="60"/>
+            </w:pPr>
+            <w:r>
+              <w:rPr>
+                <w:sz w:val="19"/>
+              </w:rPr>
+              <w:t>Significant issue. Clear and stable workaround available.</w:t>
+            </w:r>
+          </w:p>
+        </w:tc>
+        <w:tc>
+          <w:tcPr>
+            <w:tcW w:type="dxa" w:w="2304"/>
+            <w:shd w:val="clear" w:color="auto" w:fill="F8F9FA"/>
+          </w:tcPr>
+          <w:p>
+            <w:pPr>
+              <w:spacing w:before="60" w:after="60"/>
+            </w:pPr>
+            <w:r>
+              <w:rPr>
+                <w:sz w:val="19"/>
+              </w:rPr>
+              <w:t>-2% per active Medium</w:t>
+            </w:r>
+          </w:p>
+        </w:tc>
+        <w:tc>
+          <w:tcPr>
+            <w:tcW w:type="dxa" w:w="2016"/>
+            <w:shd w:val="clear" w:color="auto" w:fill="F8F9FA"/>
+          </w:tcPr>
+          <w:p>
+            <w:pPr>
+              <w:spacing w:before="60" w:after="60"/>
+            </w:pPr>
+            <w:r>
+              <w:rPr>
+                <w:sz w:val="19"/>
+              </w:rPr>
+              <w:t>5 business days</w:t>
+            </w:r>
+          </w:p>
+        </w:tc>
+      </w:tr>
+      <w:tr>
+        <w:tc>
+          <w:tcPr>
+            <w:tcW w:type="dxa" w:w="1584"/>
+            <w:shd w:val="clear" w:color="auto" w:fill="FFFFFF"/>
+          </w:tcPr>
+          <w:p>
+            <w:pPr>
+              <w:spacing w:before="60" w:after="60"/>
+            </w:pPr>
+            <w:r>
+              <w:rPr>
+                <w:sz w:val="19"/>
+              </w:rPr>
+              <w:t>Low</w:t>
+            </w:r>
+          </w:p>
+        </w:tc>
+        <w:tc>
+          <w:tcPr>
+            <w:tcW w:type="dxa" w:w="864"/>
+            <w:shd w:val="clear" w:color="auto" w:fill="FFFFFF"/>
+          </w:tcPr>
+          <w:p>
+            <w:pPr>
+              <w:spacing w:before="60" w:after="60"/>
+            </w:pPr>
+            <w:r>
+              <w:rPr>
+                <w:sz w:val="19"/>
+              </w:rPr>
+              <w:t>S4</w:t>
+            </w:r>
+          </w:p>
+        </w:tc>
+        <w:tc>
+          <w:tcPr>
+            <w:tcW w:type="dxa" w:w="3312"/>
+            <w:shd w:val="clear" w:color="auto" w:fill="FFFFFF"/>
+          </w:tcPr>
+          <w:p>
+            <w:pPr>
+              <w:spacing w:before="60" w:after="60"/>
+            </w:pPr>
+            <w:r>
+              <w:rPr>
+                <w:sz w:val="19"/>
+              </w:rPr>
+              <w:t>Trivial cosmetic issue, spelling error, or minor UI inconsistency.</w:t>
+            </w:r>
+          </w:p>
+        </w:tc>
+        <w:tc>
+          <w:tcPr>
+            <w:tcW w:type="dxa" w:w="2304"/>
+            <w:shd w:val="clear" w:color="auto" w:fill="FFFFFF"/>
+          </w:tcPr>
+          <w:p>
+            <w:pPr>
+              <w:spacing w:before="60" w:after="60"/>
+            </w:pPr>
+            <w:r>
+              <w:rPr>
+                <w:sz w:val="19"/>
+              </w:rPr>
+              <w:t>-0.5% per active Low</w:t>
+            </w:r>
+          </w:p>
+        </w:tc>
+        <w:tc>
+          <w:tcPr>
+            <w:tcW w:type="dxa" w:w="2016"/>
+            <w:shd w:val="clear" w:color="auto" w:fill="FFFFFF"/>
+          </w:tcPr>
+          <w:p>
+            <w:pPr>
+              <w:spacing w:before="60" w:after="60"/>
+            </w:pPr>
+            <w:r>
+              <w:rPr>
+                <w:sz w:val="19"/>
+              </w:rPr>
+              <w:t>10 business days</w:t>
+            </w:r>
+          </w:p>
+        </w:tc>
+      </w:tr>
+    </w:tbl>
+    <w:p>
+      <w:pPr>
+        <w:spacing w:after="120"/>
+      </w:pPr>
+    </w:p>
+    <w:p>
+      <w:pPr>
+        <w:spacing w:before="120" w:after="160"/>
+        <w:ind w:left="576"/>
+      </w:pPr>
+      <w:r>
+        <w:rPr>
+          <w:rFonts w:ascii="Courier New" w:hAnsi="Courier New"/>
+          <w:b/>
+          <w:color w:val="1E9ED5"/>
+          <w:sz w:val="21"/>
+        </w:rPr>
+        <w:t>healthDefectPenalty = (s1count*10) + (s2count*5) + (s3count*2) + (s4count*0.5)</w:t>
+      </w:r>
+    </w:p>
+    <w:p>
+      <w:pPr>
+        <w:pStyle w:val="Heading2"/>
+        <w:spacing w:before="360" w:after="120"/>
+      </w:pPr>
+      <w:r>
+        <w:rPr>
+          <w:color w:val="1E9ED5"/>
+        </w:rPr>
+        <w:t>13.2  Defect Status Lifecycle</w:t>
+      </w:r>
+    </w:p>
+    <w:tbl>
+      <w:tblPr>
+        <w:tblStyle w:val="TableGrid"/>
+        <w:tblW w:type="auto" w:w="0"/>
+        <w:jc w:val="center"/>
+        <w:tblLook w:firstColumn="1" w:firstRow="1" w:lastColumn="0" w:lastRow="0" w:noHBand="0" w:noVBand="1" w:val="04A0"/>
+      </w:tblPr>
+      <w:tblGrid>
+        <w:gridCol w:w="2268"/>
+        <w:gridCol w:w="2268"/>
+        <w:gridCol w:w="2268"/>
+        <w:gridCol w:w="2268"/>
+      </w:tblGrid>
+      <w:tr>
+        <w:tc>
+          <w:tcPr>
+            <w:tcW w:type="dxa" w:w="2160"/>
+            <w:shd w:val="clear" w:color="auto" w:fill="1A1A2E"/>
+          </w:tcPr>
+          <w:p>
+            <w:pPr>
+              <w:jc w:val="center"/>
+            </w:pPr>
+            <w:r>
+              <w:rPr>
+                <w:b/>
+                <w:color w:val="FFFFFF"/>
+                <w:sz w:val="19"/>
+              </w:rPr>
+              <w:t>From Status</w:t>
+            </w:r>
+          </w:p>
+        </w:tc>
+        <w:tc>
+          <w:tcPr>
+            <w:tcW w:type="dxa" w:w="2160"/>
+            <w:shd w:val="clear" w:color="auto" w:fill="1A1A2E"/>
+          </w:tcPr>
+          <w:p>
+            <w:pPr>
+              <w:jc w:val="center"/>
+            </w:pPr>
+            <w:r>
+              <w:rPr>
+                <w:b/>
+                <w:color w:val="FFFFFF"/>
+                <w:sz w:val="19"/>
+              </w:rPr>
+              <w:t>To Status</w:t>
+            </w:r>
+          </w:p>
+        </w:tc>
+        <w:tc>
+          <w:tcPr>
+            <w:tcW w:type="dxa" w:w="3168"/>
+            <w:shd w:val="clear" w:color="auto" w:fill="1A1A2E"/>
+          </w:tcPr>
+          <w:p>
+            <w:pPr>
+              <w:jc w:val="center"/>
+            </w:pPr>
+            <w:r>
+              <w:rPr>
+                <w:b/>
+                <w:color w:val="FFFFFF"/>
+                <w:sz w:val="19"/>
+              </w:rPr>
+              <w:t>Guard / Condition</w:t>
+            </w:r>
+          </w:p>
+        </w:tc>
+        <w:tc>
+          <w:tcPr>
+            <w:tcW w:type="dxa" w:w="2016"/>
+            <w:shd w:val="clear" w:color="auto" w:fill="1A1A2E"/>
+          </w:tcPr>
+          <w:p>
+            <w:pPr>
+              <w:jc w:val="center"/>
+            </w:pPr>
+            <w:r>
+              <w:rPr>
+                <w:b/>
+                <w:color w:val="FFFFFF"/>
+                <w:sz w:val="19"/>
+              </w:rPr>
+              <w:t>Required Effect</w:t>
+            </w:r>
+          </w:p>
+        </w:tc>
+      </w:tr>
+      <w:tr>
+        <w:tc>
+          <w:tcPr>
+            <w:tcW w:type="dxa" w:w="2160"/>
+            <w:shd w:val="clear" w:color="auto" w:fill="F8F9FA"/>
+          </w:tcPr>
+          <w:p>
+            <w:pPr>
+              <w:spacing w:before="60" w:after="60"/>
+            </w:pPr>
+            <w:r>
+              <w:rPr>
+                <w:sz w:val="19"/>
+              </w:rPr>
+              <w:t>New</w:t>
+            </w:r>
+          </w:p>
+        </w:tc>
+        <w:tc>
+          <w:tcPr>
+            <w:tcW w:type="dxa" w:w="2160"/>
+            <w:shd w:val="clear" w:color="auto" w:fill="F8F9FA"/>
+          </w:tcPr>
+          <w:p>
+            <w:pPr>
+              <w:spacing w:before="60" w:after="60"/>
+            </w:pPr>
+            <w:r>
+              <w:rPr>
+                <w:sz w:val="19"/>
+              </w:rPr>
+              <w:t>Assigned</w:t>
+            </w:r>
+          </w:p>
+        </w:tc>
+        <w:tc>
+          <w:tcPr>
+            <w:tcW w:type="dxa" w:w="3168"/>
+            <w:shd w:val="clear" w:color="auto" w:fill="F8F9FA"/>
+          </w:tcPr>
+          <w:p>
+            <w:pPr>
+              <w:spacing w:before="60" w:after="60"/>
+            </w:pPr>
+            <w:r>
+              <w:rPr>
+                <w:sz w:val="19"/>
+              </w:rPr>
+              <w:t>Owner allocated by Engineering Manager</w:t>
+            </w:r>
+          </w:p>
+        </w:tc>
+        <w:tc>
+          <w:tcPr>
+            <w:tcW w:type="dxa" w:w="2016"/>
+            <w:shd w:val="clear" w:color="auto" w:fill="F8F9FA"/>
+          </w:tcPr>
+          <w:p>
+            <w:pPr>
+              <w:spacing w:before="60" w:after="60"/>
+            </w:pPr>
+            <w:r>
+              <w:rPr>
+                <w:sz w:val="19"/>
+              </w:rPr>
+              <w:t>Log Status Changed. Notify assignee.</w:t>
+            </w:r>
+          </w:p>
+        </w:tc>
+      </w:tr>
+      <w:tr>
+        <w:tc>
+          <w:tcPr>
+            <w:tcW w:type="dxa" w:w="2160"/>
+            <w:shd w:val="clear" w:color="auto" w:fill="FFFFFF"/>
+          </w:tcPr>
+          <w:p>
+            <w:pPr>
+              <w:spacing w:before="60" w:after="60"/>
+            </w:pPr>
+            <w:r>
+              <w:rPr>
+                <w:sz w:val="19"/>
+              </w:rPr>
+              <w:t>Assigned</w:t>
+            </w:r>
+          </w:p>
+        </w:tc>
+        <w:tc>
+          <w:tcPr>
+            <w:tcW w:type="dxa" w:w="2160"/>
+            <w:shd w:val="clear" w:color="auto" w:fill="FFFFFF"/>
+          </w:tcPr>
+          <w:p>
+            <w:pPr>
+              <w:spacing w:before="60" w:after="60"/>
+            </w:pPr>
+            <w:r>
+              <w:rPr>
+                <w:sz w:val="19"/>
+              </w:rPr>
+              <w:t>Fixed</w:t>
+            </w:r>
+          </w:p>
+        </w:tc>
+        <w:tc>
+          <w:tcPr>
+            <w:tcW w:type="dxa" w:w="3168"/>
+            <w:shd w:val="clear" w:color="auto" w:fill="FFFFFF"/>
+          </w:tcPr>
+          <w:p>
+            <w:pPr>
+              <w:spacing w:before="60" w:after="60"/>
+            </w:pPr>
+            <w:r>
+              <w:rPr>
+                <w:sz w:val="19"/>
+              </w:rPr>
+              <w:t>Developer applies code fix</w:t>
+            </w:r>
+          </w:p>
+        </w:tc>
+        <w:tc>
+          <w:tcPr>
+            <w:tcW w:type="dxa" w:w="2016"/>
+            <w:shd w:val="clear" w:color="auto" w:fill="FFFFFF"/>
+          </w:tcPr>
+          <w:p>
+            <w:pPr>
+              <w:spacing w:before="60" w:after="60"/>
+            </w:pPr>
+            <w:r>
+              <w:rPr>
+                <w:sz w:val="19"/>
+              </w:rPr>
+              <w:t>Log Status Changed. SLA timer stops.</w:t>
+            </w:r>
+          </w:p>
+        </w:tc>
+      </w:tr>
+      <w:tr>
+        <w:tc>
+          <w:tcPr>
+            <w:tcW w:type="dxa" w:w="2160"/>
+            <w:shd w:val="clear" w:color="auto" w:fill="F8F9FA"/>
+          </w:tcPr>
+          <w:p>
+            <w:pPr>
+              <w:spacing w:before="60" w:after="60"/>
+            </w:pPr>
+            <w:r>
+              <w:rPr>
+                <w:sz w:val="19"/>
+              </w:rPr>
+              <w:t>Fixed</w:t>
+            </w:r>
+          </w:p>
+        </w:tc>
+        <w:tc>
+          <w:tcPr>
+            <w:tcW w:type="dxa" w:w="2160"/>
+            <w:shd w:val="clear" w:color="auto" w:fill="F8F9FA"/>
+          </w:tcPr>
+          <w:p>
+            <w:pPr>
+              <w:spacing w:before="60" w:after="60"/>
+            </w:pPr>
+            <w:r>
+              <w:rPr>
+                <w:sz w:val="19"/>
+              </w:rPr>
+              <w:t>Retest</w:t>
+            </w:r>
+          </w:p>
+        </w:tc>
+        <w:tc>
+          <w:tcPr>
+            <w:tcW w:type="dxa" w:w="3168"/>
+            <w:shd w:val="clear" w:color="auto" w:fill="F8F9FA"/>
+          </w:tcPr>
+          <w:p>
+            <w:pPr>
+              <w:spacing w:before="60" w:after="60"/>
+            </w:pPr>
+            <w:r>
+              <w:rPr>
+                <w:sz w:val="19"/>
+              </w:rPr>
+              <w:t>Fix deployed to test environment</w:t>
+            </w:r>
+          </w:p>
+        </w:tc>
+        <w:tc>
+          <w:tcPr>
+            <w:tcW w:type="dxa" w:w="2016"/>
+            <w:shd w:val="clear" w:color="auto" w:fill="F8F9FA"/>
+          </w:tcPr>
+          <w:p>
+            <w:pPr>
+              <w:spacing w:before="60" w:after="60"/>
+            </w:pPr>
+            <w:r>
+              <w:rPr>
+                <w:sz w:val="19"/>
+              </w:rPr>
+              <w:t>Log Status Changed. Notify QA.</w:t>
+            </w:r>
+          </w:p>
+        </w:tc>
+      </w:tr>
+      <w:tr>
+        <w:tc>
+          <w:tcPr>
+            <w:tcW w:type="dxa" w:w="2160"/>
+            <w:shd w:val="clear" w:color="auto" w:fill="FFFFFF"/>
+          </w:tcPr>
+          <w:p>
+            <w:pPr>
+              <w:spacing w:before="60" w:after="60"/>
+            </w:pPr>
+            <w:r>
+              <w:rPr>
+                <w:sz w:val="19"/>
+              </w:rPr>
+              <w:t>Retest</w:t>
+            </w:r>
+          </w:p>
+        </w:tc>
+        <w:tc>
+          <w:tcPr>
+            <w:tcW w:type="dxa" w:w="2160"/>
+            <w:shd w:val="clear" w:color="auto" w:fill="FFFFFF"/>
+          </w:tcPr>
+          <w:p>
+            <w:pPr>
+              <w:spacing w:before="60" w:after="60"/>
+            </w:pPr>
+            <w:r>
+              <w:rPr>
+                <w:sz w:val="19"/>
+              </w:rPr>
+              <w:t>Closed</w:t>
+            </w:r>
+          </w:p>
+        </w:tc>
+        <w:tc>
+          <w:tcPr>
+            <w:tcW w:type="dxa" w:w="3168"/>
+            <w:shd w:val="clear" w:color="auto" w:fill="FFFFFF"/>
+          </w:tcPr>
+          <w:p>
+            <w:pPr>
+              <w:spacing w:before="60" w:after="60"/>
+            </w:pPr>
+            <w:r>
+              <w:rPr>
+                <w:sz w:val="19"/>
+              </w:rPr>
+              <w:t>QA verifies fix is correct</w:t>
+            </w:r>
+          </w:p>
+        </w:tc>
+        <w:tc>
+          <w:tcPr>
+            <w:tcW w:type="dxa" w:w="2016"/>
+            <w:shd w:val="clear" w:color="auto" w:fill="FFFFFF"/>
+          </w:tcPr>
+          <w:p>
+            <w:pPr>
+              <w:spacing w:before="60" w:after="60"/>
+            </w:pPr>
+            <w:r>
+              <w:rPr>
+                <w:sz w:val="19"/>
+              </w:rPr>
+              <w:t>Set closedDate. Health penalty removed.</w:t>
+            </w:r>
+          </w:p>
+        </w:tc>
+      </w:tr>
+      <w:tr>
+        <w:tc>
+          <w:tcPr>
+            <w:tcW w:type="dxa" w:w="2160"/>
+            <w:shd w:val="clear" w:color="auto" w:fill="F8F9FA"/>
+          </w:tcPr>
+          <w:p>
+            <w:pPr>
+              <w:spacing w:before="60" w:after="60"/>
+            </w:pPr>
+            <w:r>
+              <w:rPr>
+                <w:sz w:val="19"/>
+              </w:rPr>
+              <w:t>Retest</w:t>
+            </w:r>
+          </w:p>
+        </w:tc>
+        <w:tc>
+          <w:tcPr>
+            <w:tcW w:type="dxa" w:w="2160"/>
+            <w:shd w:val="clear" w:color="auto" w:fill="F8F9FA"/>
+          </w:tcPr>
+          <w:p>
+            <w:pPr>
+              <w:spacing w:before="60" w:after="60"/>
+            </w:pPr>
+            <w:r>
+              <w:rPr>
+                <w:sz w:val="19"/>
+              </w:rPr>
+              <w:t>Assigned</w:t>
+            </w:r>
+          </w:p>
+        </w:tc>
+        <w:tc>
+          <w:tcPr>
+            <w:tcW w:type="dxa" w:w="3168"/>
+            <w:shd w:val="clear" w:color="auto" w:fill="F8F9FA"/>
+          </w:tcPr>
+          <w:p>
+            <w:pPr>
+              <w:spacing w:before="60" w:after="60"/>
+            </w:pPr>
+            <w:r>
+              <w:rPr>
+                <w:sz w:val="19"/>
+              </w:rPr>
+              <w:t>QA finds fix incomplete (re-open)</w:t>
+            </w:r>
+          </w:p>
+        </w:tc>
+        <w:tc>
+          <w:tcPr>
+            <w:tcW w:type="dxa" w:w="2016"/>
+            <w:shd w:val="clear" w:color="auto" w:fill="F8F9FA"/>
+          </w:tcPr>
+          <w:p>
+            <w:pPr>
+              <w:spacing w:before="60" w:after="60"/>
+            </w:pPr>
+            <w:r>
+              <w:rPr>
+                <w:sz w:val="19"/>
+              </w:rPr>
+              <w:t>Log Status Changed. Notify developer.</w:t>
+            </w:r>
+          </w:p>
+        </w:tc>
+      </w:tr>
+      <w:tr>
+        <w:tc>
+          <w:tcPr>
+            <w:tcW w:type="dxa" w:w="2160"/>
+            <w:shd w:val="clear" w:color="auto" w:fill="FFFFFF"/>
+          </w:tcPr>
+          <w:p>
+            <w:pPr>
+              <w:spacing w:before="60" w:after="60"/>
+            </w:pPr>
+            <w:r>
+              <w:rPr>
+                <w:sz w:val="19"/>
+              </w:rPr>
+              <w:t>New</w:t>
+            </w:r>
+          </w:p>
+        </w:tc>
+        <w:tc>
+          <w:tcPr>
+            <w:tcW w:type="dxa" w:w="2160"/>
+            <w:shd w:val="clear" w:color="auto" w:fill="FFFFFF"/>
+          </w:tcPr>
+          <w:p>
+            <w:pPr>
+              <w:spacing w:before="60" w:after="60"/>
+            </w:pPr>
+            <w:r>
+              <w:rPr>
+                <w:sz w:val="19"/>
+              </w:rPr>
+              <w:t>Rejected</w:t>
+            </w:r>
+          </w:p>
+        </w:tc>
+        <w:tc>
+          <w:tcPr>
+            <w:tcW w:type="dxa" w:w="3168"/>
+            <w:shd w:val="clear" w:color="auto" w:fill="FFFFFF"/>
+          </w:tcPr>
+          <w:p>
+            <w:pPr>
+              <w:spacing w:before="60" w:after="60"/>
+            </w:pPr>
+            <w:r>
+              <w:rPr>
+                <w:sz w:val="19"/>
+              </w:rPr>
+              <w:t>Defect is by design or not reproducible</w:t>
+            </w:r>
+          </w:p>
+        </w:tc>
+        <w:tc>
+          <w:tcPr>
+            <w:tcW w:type="dxa" w:w="2016"/>
+            <w:shd w:val="clear" w:color="auto" w:fill="FFFFFF"/>
+          </w:tcPr>
+          <w:p>
+            <w:pPr>
+              <w:spacing w:before="60" w:after="60"/>
+            </w:pPr>
+            <w:r>
+              <w:rPr>
+                <w:sz w:val="19"/>
+              </w:rPr>
+              <w:t>Set closedDate. Log rejection reason.</w:t>
+            </w:r>
+          </w:p>
+        </w:tc>
+      </w:tr>
+      <w:tr>
+        <w:tc>
+          <w:tcPr>
+            <w:tcW w:type="dxa" w:w="2160"/>
+            <w:shd w:val="clear" w:color="auto" w:fill="F8F9FA"/>
+          </w:tcPr>
+          <w:p>
+            <w:pPr>
+              <w:spacing w:before="60" w:after="60"/>
+            </w:pPr>
+            <w:r>
+              <w:rPr>
+                <w:sz w:val="19"/>
+              </w:rPr>
+              <w:t>Assigned</w:t>
+            </w:r>
+          </w:p>
+        </w:tc>
+        <w:tc>
+          <w:tcPr>
+            <w:tcW w:type="dxa" w:w="2160"/>
+            <w:shd w:val="clear" w:color="auto" w:fill="F8F9FA"/>
+          </w:tcPr>
+          <w:p>
+            <w:pPr>
+              <w:spacing w:before="60" w:after="60"/>
+            </w:pPr>
+            <w:r>
+              <w:rPr>
+                <w:sz w:val="19"/>
+              </w:rPr>
+              <w:t>Rejected</w:t>
+            </w:r>
+          </w:p>
+        </w:tc>
+        <w:tc>
+          <w:tcPr>
+            <w:tcW w:type="dxa" w:w="3168"/>
+            <w:shd w:val="clear" w:color="auto" w:fill="F8F9FA"/>
+          </w:tcPr>
+          <w:p>
+            <w:pPr>
+              <w:spacing w:before="60" w:after="60"/>
+            </w:pPr>
+            <w:r>
+              <w:rPr>
+                <w:sz w:val="19"/>
+              </w:rPr>
+              <w:t>Investigation reveals non-defect</w:t>
+            </w:r>
+          </w:p>
+        </w:tc>
+        <w:tc>
+          <w:tcPr>
+            <w:tcW w:type="dxa" w:w="2016"/>
+            <w:shd w:val="clear" w:color="auto" w:fill="F8F9FA"/>
+          </w:tcPr>
+          <w:p>
+            <w:pPr>
+              <w:spacing w:before="60" w:after="60"/>
+            </w:pPr>
+            <w:r>
+              <w:rPr>
+                <w:sz w:val="19"/>
+              </w:rPr>
+              <w:t>Set closedDate. Log rejection reason.</w:t>
+            </w:r>
+          </w:p>
+        </w:tc>
+      </w:tr>
+      <w:tr>
+        <w:tc>
+          <w:tcPr>
+            <w:tcW w:type="dxa" w:w="2160"/>
+            <w:shd w:val="clear" w:color="auto" w:fill="FFFFFF"/>
+          </w:tcPr>
+          <w:p>
+            <w:pPr>
+              <w:spacing w:before="60" w:after="60"/>
+            </w:pPr>
+            <w:r>
+              <w:rPr>
+                <w:sz w:val="19"/>
+              </w:rPr>
+              <w:t>Assigned</w:t>
+            </w:r>
+          </w:p>
+        </w:tc>
+        <w:tc>
+          <w:tcPr>
+            <w:tcW w:type="dxa" w:w="2160"/>
+            <w:shd w:val="clear" w:color="auto" w:fill="FFFFFF"/>
+          </w:tcPr>
+          <w:p>
+            <w:pPr>
+              <w:spacing w:before="60" w:after="60"/>
+            </w:pPr>
+            <w:r>
+              <w:rPr>
+                <w:sz w:val="19"/>
+              </w:rPr>
+              <w:t>Deferred</w:t>
+            </w:r>
+          </w:p>
+        </w:tc>
+        <w:tc>
+          <w:tcPr>
+            <w:tcW w:type="dxa" w:w="3168"/>
+            <w:shd w:val="clear" w:color="auto" w:fill="FFFFFF"/>
+          </w:tcPr>
+          <w:p>
+            <w:pPr>
+              <w:spacing w:before="60" w:after="60"/>
+            </w:pPr>
+            <w:r>
+              <w:rPr>
+                <w:sz w:val="19"/>
+              </w:rPr>
+              <w:t>Fix postponed to future release</w:t>
+            </w:r>
+          </w:p>
+        </w:tc>
+        <w:tc>
+          <w:tcPr>
+            <w:tcW w:type="dxa" w:w="2016"/>
+            <w:shd w:val="clear" w:color="auto" w:fill="FFFFFF"/>
+          </w:tcPr>
+          <w:p>
+            <w:pPr>
+              <w:spacing w:before="60" w:after="60"/>
+            </w:pPr>
+            <w:r>
+              <w:rPr>
+                <w:sz w:val="19"/>
+              </w:rPr>
+              <w:t>Log Status Changed with release target.</w:t>
+            </w:r>
+          </w:p>
+        </w:tc>
+      </w:tr>
+    </w:tbl>
+    <w:p>
+      <w:pPr>
+        <w:spacing w:after="120"/>
+      </w:pPr>
+    </w:p>
+    <w:p>
+      <w:pPr>
+        <w:pStyle w:val="Heading2"/>
+        <w:spacing w:before="360" w:after="120"/>
+      </w:pPr>
+      <w:r>
+        <w:rPr>
+          <w:color w:val="1E9ED5"/>
+        </w:rPr>
+        <w:t>13.3  S1 Blocker Escalation Workflow</w:t>
+      </w:r>
+    </w:p>
+    <w:p>
+      <w:pPr>
+        <w:pStyle w:val="ListNumber"/>
+        <w:spacing w:before="0" w:after="60"/>
+      </w:pPr>
+      <w:r>
+        <w:rPr>
+          <w:sz w:val="21"/>
+        </w:rPr>
+        <w:t>S1 Blocker logged: Red alert banner immediately appears on Overview Dashboard.</w:t>
+      </w:r>
+    </w:p>
+    <w:p>
+      <w:pPr>
+        <w:pStyle w:val="ListNumber"/>
+        <w:spacing w:before="0" w:after="60"/>
+      </w:pPr>
+      <w:r>
+        <w:rPr>
+          <w:sz w:val="21"/>
+        </w:rPr>
+        <w:t>24-hour SLA countdown timer starts from defect creation timestamp.</w:t>
+      </w:r>
+    </w:p>
+    <w:p>
+      <w:pPr>
+        <w:pStyle w:val="ListNumber"/>
+        <w:spacing w:before="0" w:after="60"/>
+      </w:pPr>
+      <w:r>
+        <w:rPr>
+          <w:sz w:val="21"/>
+        </w:rPr>
+        <w:t>If defect remains in New or Assigned status after 24 hours: in-app notification sent to Engineering Manager.</w:t>
+      </w:r>
+    </w:p>
+    <w:p>
+      <w:pPr>
+        <w:pStyle w:val="ListNumber"/>
+        <w:spacing w:before="0" w:after="60"/>
+      </w:pPr>
+      <w:r>
+        <w:rPr>
+          <w:sz w:val="21"/>
+        </w:rPr>
+        <w:t>SLA breach is flagged in the Defect Tracker with a red SLA badge.</w:t>
+      </w:r>
+    </w:p>
+    <w:p>
+      <w:pPr>
+        <w:pStyle w:val="ListNumber"/>
+        <w:spacing w:before="0" w:after="60"/>
+      </w:pPr>
+      <w:r>
+        <w:rPr>
+          <w:sz w:val="21"/>
+        </w:rPr>
+        <w:t>Defect remains flagged until status transitions to Fixed or beyond.</w:t>
+      </w:r>
+    </w:p>
+    <w:p>
+      <w:r>
+        <w:br w:type="page"/>
+      </w:r>
+    </w:p>
+    <w:p>
+      <w:pPr>
+        <w:pStyle w:val="Heading1"/>
+        <w:spacing w:before="360" w:after="120"/>
+      </w:pPr>
+      <w:r>
+        <w:rPr>
+          <w:color w:val="0D1B2A"/>
+        </w:rPr>
+        <w:t>14  Reports &amp; Board Packs</w:t>
+      </w:r>
+    </w:p>
+    <w:p>
+      <w:pPr>
+        <w:pBdr>
+          <w:bottom w:val="single" w:sz="6" w:space="1" w:color="00C2A8"/>
+        </w:pBdr>
+        <w:spacing w:before="0" w:after="120"/>
+      </w:pPr>
+    </w:p>
+    <w:p>
+      <w:pPr>
+        <w:spacing w:before="0" w:after="160"/>
+      </w:pPr>
+      <w:r>
+        <w:rPr>
+          <w:sz w:val="21"/>
+        </w:rPr>
+        <w:t>The Reports module provides one-click generation of an Executive Board Pack and a professional multi-sheet Excel workbook export with live formulas.</w:t>
+      </w:r>
+    </w:p>
+    <w:p>
+      <w:pPr>
+        <w:spacing w:before="160" w:after="0"/>
+        <w:jc w:val="center"/>
+      </w:pPr>
+      <w:r>
+        <w:drawing>
+          <wp:inline xmlns:a="http://schemas.openxmlformats.org/drawingml/2006/main" xmlns:pic="http://schemas.openxmlformats.org/drawingml/2006/picture">
+            <wp:extent cx="5760720" cy="3240405"/>
+            <wp:docPr id="8" name="Picture 8"/>
+            <wp:cNvGraphicFramePr>
+              <a:graphicFrameLocks noChangeAspect="1"/>
+            </wp:cNvGraphicFramePr>
+            <a:graphic>
+              <a:graphicData uri="http://schemas.openxmlformats.org/drawingml/2006/picture">
+                <pic:pic>
+                  <pic:nvPicPr>
+                    <pic:cNvPr id="0" name="08_reports_boardpack.png"/>
                     <pic:cNvPicPr/>
                   </pic:nvPicPr>
                   <pic:blipFill>
@@ -20488,7 +21811,7 @@
           <w:color w:val="6C757D"/>
           <w:sz w:val="18"/>
         </w:rPr>
-        <w:t>Figure 13.1 — Defect Tracker: severity cards, defect register, and lifecycle workflow</w:t>
+        <w:t>Figure 14.1 — Reports &amp; Board Packs: export builder, preview panel, workbook sheet map</w:t>
       </w:r>
     </w:p>
     <w:p>
@@ -20500,7 +21823,91 @@
         <w:rPr>
           <w:color w:val="1E9ED5"/>
         </w:rPr>
-        <w:t>13.1  Severity Matrix &amp; SLA Targets</w:t>
+        <w:t>14.1  Executive Board Pack — Generation Workflow</w:t>
+      </w:r>
+    </w:p>
+    <w:p>
+      <w:pPr>
+        <w:spacing w:before="0" w:after="120"/>
+      </w:pPr>
+      <w:r>
+        <w:rPr>
+          <w:sz w:val="21"/>
+        </w:rPr>
+        <w:t>The Board Pack is assembled programmatically from live P.cache data:</w:t>
+      </w:r>
+    </w:p>
+    <w:p>
+      <w:pPr>
+        <w:pStyle w:val="ListNumber"/>
+        <w:spacing w:before="0" w:after="60"/>
+      </w:pPr>
+      <w:r>
+        <w:rPr>
+          <w:sz w:val="21"/>
+        </w:rPr>
+        <w:t>Project Summary Narrative: auto-generated paragraph from health signals, milestone status, and top risks.</w:t>
+      </w:r>
+    </w:p>
+    <w:p>
+      <w:pPr>
+        <w:pStyle w:val="ListNumber"/>
+        <w:spacing w:before="0" w:after="60"/>
+      </w:pPr>
+      <w:r>
+        <w:rPr>
+          <w:sz w:val="21"/>
+        </w:rPr>
+        <w:t>Health Trend Sparkline: 8-week history of Health Index from P.cache.velocityHistory.</w:t>
+      </w:r>
+    </w:p>
+    <w:p>
+      <w:pPr>
+        <w:pStyle w:val="ListNumber"/>
+        <w:spacing w:before="0" w:after="60"/>
+      </w:pPr>
+      <w:r>
+        <w:rPr>
+          <w:sz w:val="21"/>
+        </w:rPr>
+        <w:t>Critical Path Tasks: all tasks on the critical path within 5 days of or past their due date.</w:t>
+      </w:r>
+    </w:p>
+    <w:p>
+      <w:pPr>
+        <w:pStyle w:val="ListNumber"/>
+        <w:spacing w:before="0" w:after="60"/>
+      </w:pPr>
+      <w:r>
+        <w:rPr>
+          <w:sz w:val="21"/>
+        </w:rPr>
+        <w:t>Top 5 RAID Items: RAID items ranked by exposureScore descending, with owner and mitigation summary.</w:t>
+      </w:r>
+    </w:p>
+    <w:p>
+      <w:pPr>
+        <w:pStyle w:val="ListNumber"/>
+        <w:spacing w:before="0" w:after="60"/>
+      </w:pPr>
+      <w:r>
+        <w:rPr>
+          <w:sz w:val="21"/>
+        </w:rPr>
+        <w:t>Team Velocity: 4-week rolling average from P.cache.velocityHistory.</w:t>
+      </w:r>
+    </w:p>
+    <w:p/>
+    <w:p>
+      <w:pPr>
+        <w:pStyle w:val="Heading2"/>
+        <w:spacing w:before="360" w:after="120"/>
+      </w:pPr>
+      <w:r>
+        <w:rPr>
+          <w:color w:val="1E9ED5"/>
+        </w:rPr>
+        <w:t>14.2  Excel Workbook Architecture — 8 Sheets</w:t>
       </w:r>
     </w:p>
     <w:tbl>
@@ -20511,16 +21918,14 @@
         <w:tblLook w:firstColumn="1" w:firstRow="1" w:lastColumn="0" w:lastRow="0" w:noHBand="0" w:noVBand="1" w:val="04A0"/>
       </w:tblPr>
       <w:tblGrid>
-        <w:gridCol w:w="1814"/>
-        <w:gridCol w:w="1814"/>
-        <w:gridCol w:w="1814"/>
-        <w:gridCol w:w="1814"/>
-        <w:gridCol w:w="1814"/>
+        <w:gridCol w:w="3024"/>
+        <w:gridCol w:w="3024"/>
+        <w:gridCol w:w="3024"/>
       </w:tblGrid>
       <w:tr>
         <w:tc>
           <w:tcPr>
-            <w:tcW w:type="dxa" w:w="1584"/>
+            <w:tcW w:type="dxa" w:w="2160"/>
             <w:shd w:val="clear" w:color="auto" w:fill="0D1B2A"/>
           </w:tcPr>
           <w:p>
@@ -20533,13 +21938,13 @@
                 <w:color w:val="FFFFFF"/>
                 <w:sz w:val="19"/>
               </w:rPr>
-              <w:t>Severity</w:t>
-            </w:r>
-          </w:p>
-        </w:tc>
-        <w:tc>
-          <w:tcPr>
-            <w:tcW w:type="dxa" w:w="864"/>
+              <w:t>Sheet</w:t>
+            </w:r>
+          </w:p>
+        </w:tc>
+        <w:tc>
+          <w:tcPr>
+            <w:tcW w:type="dxa" w:w="5040"/>
             <w:shd w:val="clear" w:color="auto" w:fill="0D1B2A"/>
           </w:tcPr>
           <w:p>
@@ -20552,13 +21957,13 @@
                 <w:color w:val="FFFFFF"/>
                 <w:sz w:val="19"/>
               </w:rPr>
-              <w:t>Code</w:t>
-            </w:r>
-          </w:p>
-        </w:tc>
-        <w:tc>
-          <w:tcPr>
-            <w:tcW w:type="dxa" w:w="3312"/>
+              <w:t>Contents</w:t>
+            </w:r>
+          </w:p>
+        </w:tc>
+        <w:tc>
+          <w:tcPr>
+            <w:tcW w:type="dxa" w:w="2016"/>
             <w:shd w:val="clear" w:color="auto" w:fill="0D1B2A"/>
           </w:tcPr>
           <w:p>
@@ -20571,45 +21976,7 @@
                 <w:color w:val="FFFFFF"/>
                 <w:sz w:val="19"/>
               </w:rPr>
-              <w:t>Definition</w:t>
-            </w:r>
-          </w:p>
-        </w:tc>
-        <w:tc>
-          <w:tcPr>
-            <w:tcW w:type="dxa" w:w="2304"/>
-            <w:shd w:val="clear" w:color="auto" w:fill="0D1B2A"/>
-          </w:tcPr>
-          <w:p>
-            <w:pPr>
-              <w:jc w:val="center"/>
-            </w:pPr>
-            <w:r>
-              <w:rPr>
-                <w:b/>
-                <w:color w:val="FFFFFF"/>
-                <w:sz w:val="19"/>
-              </w:rPr>
-              <w:t>Health Index Impact</w:t>
-            </w:r>
-          </w:p>
-        </w:tc>
-        <w:tc>
-          <w:tcPr>
-            <w:tcW w:type="dxa" w:w="2016"/>
-            <w:shd w:val="clear" w:color="auto" w:fill="0D1B2A"/>
-          </w:tcPr>
-          <w:p>
-            <w:pPr>
-              <w:jc w:val="center"/>
-            </w:pPr>
-            <w:r>
-              <w:rPr>
-                <w:b/>
-                <w:color w:val="FFFFFF"/>
-                <w:sz w:val="19"/>
-              </w:rPr>
-              <w:t>SLA Target</w:t>
+              <w:t>Live Formulas</w:t>
             </w:r>
           </w:p>
         </w:tc>
@@ -20617,69 +21984,35 @@
       <w:tr>
         <w:tc>
           <w:tcPr>
-            <w:tcW w:type="dxa" w:w="1584"/>
-            <w:shd w:val="clear" w:color="auto" w:fill="F8F9FA"/>
-          </w:tcPr>
-          <w:p>
-            <w:pPr>
-              <w:spacing w:before="60" w:after="60"/>
-            </w:pPr>
-            <w:r>
-              <w:rPr>
-                <w:sz w:val="19"/>
-              </w:rPr>
-              <w:t>Blocker</w:t>
-            </w:r>
-          </w:p>
-        </w:tc>
-        <w:tc>
-          <w:tcPr>
-            <w:tcW w:type="dxa" w:w="864"/>
-            <w:shd w:val="clear" w:color="auto" w:fill="F8F9FA"/>
-          </w:tcPr>
-          <w:p>
-            <w:pPr>
-              <w:spacing w:before="60" w:after="60"/>
-            </w:pPr>
-            <w:r>
-              <w:rPr>
-                <w:sz w:val="19"/>
-              </w:rPr>
-              <w:t>S1</w:t>
-            </w:r>
-          </w:p>
-        </w:tc>
-        <w:tc>
-          <w:tcPr>
-            <w:tcW w:type="dxa" w:w="3312"/>
-            <w:shd w:val="clear" w:color="auto" w:fill="F8F9FA"/>
-          </w:tcPr>
-          <w:p>
-            <w:pPr>
-              <w:spacing w:before="60" w:after="60"/>
-            </w:pPr>
-            <w:r>
-              <w:rPr>
-                <w:sz w:val="19"/>
-              </w:rPr>
-              <w:t>Critical function completely broken. No workaround. Application unusable.</w:t>
-            </w:r>
-          </w:p>
-        </w:tc>
-        <w:tc>
-          <w:tcPr>
-            <w:tcW w:type="dxa" w:w="2304"/>
-            <w:shd w:val="clear" w:color="auto" w:fill="F8F9FA"/>
-          </w:tcPr>
-          <w:p>
-            <w:pPr>
-              <w:spacing w:before="60" w:after="60"/>
-            </w:pPr>
-            <w:r>
-              <w:rPr>
-                <w:sz w:val="19"/>
-              </w:rPr>
-              <w:t>-10% per active Blocker</w:t>
+            <w:tcW w:type="dxa" w:w="2160"/>
+            <w:shd w:val="clear" w:color="auto" w:fill="F8F9FA"/>
+          </w:tcPr>
+          <w:p>
+            <w:pPr>
+              <w:spacing w:before="60" w:after="60"/>
+            </w:pPr>
+            <w:r>
+              <w:rPr>
+                <w:sz w:val="19"/>
+              </w:rPr>
+              <w:t>System State</w:t>
+            </w:r>
+          </w:p>
+        </w:tc>
+        <w:tc>
+          <w:tcPr>
+            <w:tcW w:type="dxa" w:w="5040"/>
+            <w:shd w:val="clear" w:color="auto" w:fill="F8F9FA"/>
+          </w:tcPr>
+          <w:p>
+            <w:pPr>
+              <w:spacing w:before="60" w:after="60"/>
+            </w:pPr>
+            <w:r>
+              <w:rPr>
+                <w:sz w:val="19"/>
+              </w:rPr>
+              <w:t>Project name, description, settings, effort unit, last saved timestamp, file sync path.</w:t>
             </w:r>
           </w:p>
         </w:tc>
@@ -20696,7 +22029,7 @@
               <w:rPr>
                 <w:sz w:val="19"/>
               </w:rPr>
-              <w:t>24 hours</w:t>
+              <w:t>No</w:t>
             </w:r>
           </w:p>
         </w:tc>
@@ -20704,7 +22037,7 @@
       <w:tr>
         <w:tc>
           <w:tcPr>
-            <w:tcW w:type="dxa" w:w="1584"/>
+            <w:tcW w:type="dxa" w:w="2160"/>
             <w:shd w:val="clear" w:color="auto" w:fill="FFFFFF"/>
           </w:tcPr>
           <w:p>
@@ -20715,13 +22048,13 @@
               <w:rPr>
                 <w:sz w:val="19"/>
               </w:rPr>
-              <w:t>High</w:t>
-            </w:r>
-          </w:p>
-        </w:tc>
-        <w:tc>
-          <w:tcPr>
-            <w:tcW w:type="dxa" w:w="864"/>
+              <w:t>Tasks</w:t>
+            </w:r>
+          </w:p>
+        </w:tc>
+        <w:tc>
+          <w:tcPr>
+            <w:tcW w:type="dxa" w:w="5040"/>
             <w:shd w:val="clear" w:color="auto" w:fill="FFFFFF"/>
           </w:tcPr>
           <w:p>
@@ -20732,41 +22065,7 @@
               <w:rPr>
                 <w:sz w:val="19"/>
               </w:rPr>
-              <w:t>S2</w:t>
-            </w:r>
-          </w:p>
-        </w:tc>
-        <w:tc>
-          <w:tcPr>
-            <w:tcW w:type="dxa" w:w="3312"/>
-            <w:shd w:val="clear" w:color="auto" w:fill="FFFFFF"/>
-          </w:tcPr>
-          <w:p>
-            <w:pPr>
-              <w:spacing w:before="60" w:after="60"/>
-            </w:pPr>
-            <w:r>
-              <w:rPr>
-                <w:sz w:val="19"/>
-              </w:rPr>
-              <w:t>Major functionality impaired. Temporary workaround exists but is impractical.</w:t>
-            </w:r>
-          </w:p>
-        </w:tc>
-        <w:tc>
-          <w:tcPr>
-            <w:tcW w:type="dxa" w:w="2304"/>
-            <w:shd w:val="clear" w:color="auto" w:fill="FFFFFF"/>
-          </w:tcPr>
-          <w:p>
-            <w:pPr>
-              <w:spacing w:before="60" w:after="60"/>
-            </w:pPr>
-            <w:r>
-              <w:rPr>
-                <w:sz w:val="19"/>
-              </w:rPr>
-              <w:t>-5% per active High</w:t>
+              <w:t>Full task register: all fields, baseline dates, variance calculations, slippage reasons.</w:t>
             </w:r>
           </w:p>
         </w:tc>
@@ -20783,7 +22082,7 @@
               <w:rPr>
                 <w:sz w:val="19"/>
               </w:rPr>
-              <w:t>48 hours</w:t>
+              <w:t>Yes (variance)</w:t>
             </w:r>
           </w:p>
         </w:tc>
@@ -20791,69 +22090,35 @@
       <w:tr>
         <w:tc>
           <w:tcPr>
-            <w:tcW w:type="dxa" w:w="1584"/>
-            <w:shd w:val="clear" w:color="auto" w:fill="F8F9FA"/>
-          </w:tcPr>
-          <w:p>
-            <w:pPr>
-              <w:spacing w:before="60" w:after="60"/>
-            </w:pPr>
-            <w:r>
-              <w:rPr>
-                <w:sz w:val="19"/>
-              </w:rPr>
-              <w:t>Medium</w:t>
-            </w:r>
-          </w:p>
-        </w:tc>
-        <w:tc>
-          <w:tcPr>
-            <w:tcW w:type="dxa" w:w="864"/>
-            <w:shd w:val="clear" w:color="auto" w:fill="F8F9FA"/>
-          </w:tcPr>
-          <w:p>
-            <w:pPr>
-              <w:spacing w:before="60" w:after="60"/>
-            </w:pPr>
-            <w:r>
-              <w:rPr>
-                <w:sz w:val="19"/>
-              </w:rPr>
-              <w:t>S3</w:t>
-            </w:r>
-          </w:p>
-        </w:tc>
-        <w:tc>
-          <w:tcPr>
-            <w:tcW w:type="dxa" w:w="3312"/>
-            <w:shd w:val="clear" w:color="auto" w:fill="F8F9FA"/>
-          </w:tcPr>
-          <w:p>
-            <w:pPr>
-              <w:spacing w:before="60" w:after="60"/>
-            </w:pPr>
-            <w:r>
-              <w:rPr>
-                <w:sz w:val="19"/>
-              </w:rPr>
-              <w:t>Significant issue. Clear and stable workaround available.</w:t>
-            </w:r>
-          </w:p>
-        </w:tc>
-        <w:tc>
-          <w:tcPr>
-            <w:tcW w:type="dxa" w:w="2304"/>
-            <w:shd w:val="clear" w:color="auto" w:fill="F8F9FA"/>
-          </w:tcPr>
-          <w:p>
-            <w:pPr>
-              <w:spacing w:before="60" w:after="60"/>
-            </w:pPr>
-            <w:r>
-              <w:rPr>
-                <w:sz w:val="19"/>
-              </w:rPr>
-              <w:t>-2% per active Medium</w:t>
+            <w:tcW w:type="dxa" w:w="2160"/>
+            <w:shd w:val="clear" w:color="auto" w:fill="F8F9FA"/>
+          </w:tcPr>
+          <w:p>
+            <w:pPr>
+              <w:spacing w:before="60" w:after="60"/>
+            </w:pPr>
+            <w:r>
+              <w:rPr>
+                <w:sz w:val="19"/>
+              </w:rPr>
+              <w:t>Team</w:t>
+            </w:r>
+          </w:p>
+        </w:tc>
+        <w:tc>
+          <w:tcPr>
+            <w:tcW w:type="dxa" w:w="5040"/>
+            <w:shd w:val="clear" w:color="auto" w:fill="F8F9FA"/>
+          </w:tcPr>
+          <w:p>
+            <w:pPr>
+              <w:spacing w:before="60" w:after="60"/>
+            </w:pPr>
+            <w:r>
+              <w:rPr>
+                <w:sz w:val="19"/>
+              </w:rPr>
+              <w:t>Member directory: roles, statuses, capacity parameters, leave records.</w:t>
             </w:r>
           </w:p>
         </w:tc>
@@ -20870,7 +22135,7 @@
               <w:rPr>
                 <w:sz w:val="19"/>
               </w:rPr>
-              <w:t>5 business days</w:t>
+              <w:t>No</w:t>
             </w:r>
           </w:p>
         </w:tc>
@@ -20878,7 +22143,7 @@
       <w:tr>
         <w:tc>
           <w:tcPr>
-            <w:tcW w:type="dxa" w:w="1584"/>
+            <w:tcW w:type="dxa" w:w="2160"/>
             <w:shd w:val="clear" w:color="auto" w:fill="FFFFFF"/>
           </w:tcPr>
           <w:p>
@@ -20889,13 +22154,13 @@
               <w:rPr>
                 <w:sz w:val="19"/>
               </w:rPr>
-              <w:t>Low</w:t>
-            </w:r>
-          </w:p>
-        </w:tc>
-        <w:tc>
-          <w:tcPr>
-            <w:tcW w:type="dxa" w:w="864"/>
+              <w:t>RAID Register</w:t>
+            </w:r>
+          </w:p>
+        </w:tc>
+        <w:tc>
+          <w:tcPr>
+            <w:tcW w:type="dxa" w:w="5040"/>
             <w:shd w:val="clear" w:color="auto" w:fill="FFFFFF"/>
           </w:tcPr>
           <w:p>
@@ -20906,41 +22171,7 @@
               <w:rPr>
                 <w:sz w:val="19"/>
               </w:rPr>
-              <w:t>S4</w:t>
-            </w:r>
-          </w:p>
-        </w:tc>
-        <w:tc>
-          <w:tcPr>
-            <w:tcW w:type="dxa" w:w="3312"/>
-            <w:shd w:val="clear" w:color="auto" w:fill="FFFFFF"/>
-          </w:tcPr>
-          <w:p>
-            <w:pPr>
-              <w:spacing w:before="60" w:after="60"/>
-            </w:pPr>
-            <w:r>
-              <w:rPr>
-                <w:sz w:val="19"/>
-              </w:rPr>
-              <w:t>Trivial cosmetic issue, spelling error, or minor UI inconsistency.</w:t>
-            </w:r>
-          </w:p>
-        </w:tc>
-        <w:tc>
-          <w:tcPr>
-            <w:tcW w:type="dxa" w:w="2304"/>
-            <w:shd w:val="clear" w:color="auto" w:fill="FFFFFF"/>
-          </w:tcPr>
-          <w:p>
-            <w:pPr>
-              <w:spacing w:before="60" w:after="60"/>
-            </w:pPr>
-            <w:r>
-              <w:rPr>
-                <w:sz w:val="19"/>
-              </w:rPr>
-              <w:t>-0.5% per active Low</w:t>
+              <w:t>All RAID items: type, exposure score, owner, mitigation, status lifecycle.</w:t>
             </w:r>
           </w:p>
         </w:tc>
@@ -20957,7 +22188,219 @@
               <w:rPr>
                 <w:sz w:val="19"/>
               </w:rPr>
-              <w:t>10 business days</w:t>
+              <w:t>Yes (exposure)</w:t>
+            </w:r>
+          </w:p>
+        </w:tc>
+      </w:tr>
+      <w:tr>
+        <w:tc>
+          <w:tcPr>
+            <w:tcW w:type="dxa" w:w="2160"/>
+            <w:shd w:val="clear" w:color="auto" w:fill="F8F9FA"/>
+          </w:tcPr>
+          <w:p>
+            <w:pPr>
+              <w:spacing w:before="60" w:after="60"/>
+            </w:pPr>
+            <w:r>
+              <w:rPr>
+                <w:sz w:val="19"/>
+              </w:rPr>
+              <w:t>Defects</w:t>
+            </w:r>
+          </w:p>
+        </w:tc>
+        <w:tc>
+          <w:tcPr>
+            <w:tcW w:type="dxa" w:w="5040"/>
+            <w:shd w:val="clear" w:color="auto" w:fill="F8F9FA"/>
+          </w:tcPr>
+          <w:p>
+            <w:pPr>
+              <w:spacing w:before="60" w:after="60"/>
+            </w:pPr>
+            <w:r>
+              <w:rPr>
+                <w:sz w:val="19"/>
+              </w:rPr>
+              <w:t>Complete defect log: severity, priority, status, SLA, linked tasks, repro steps.</w:t>
+            </w:r>
+          </w:p>
+        </w:tc>
+        <w:tc>
+          <w:tcPr>
+            <w:tcW w:type="dxa" w:w="2016"/>
+            <w:shd w:val="clear" w:color="auto" w:fill="F8F9FA"/>
+          </w:tcPr>
+          <w:p>
+            <w:pPr>
+              <w:spacing w:before="60" w:after="60"/>
+            </w:pPr>
+            <w:r>
+              <w:rPr>
+                <w:sz w:val="19"/>
+              </w:rPr>
+              <w:t>Yes (SLA)</w:t>
+            </w:r>
+          </w:p>
+        </w:tc>
+      </w:tr>
+      <w:tr>
+        <w:tc>
+          <w:tcPr>
+            <w:tcW w:type="dxa" w:w="2160"/>
+            <w:shd w:val="clear" w:color="auto" w:fill="FFFFFF"/>
+          </w:tcPr>
+          <w:p>
+            <w:pPr>
+              <w:spacing w:before="60" w:after="60"/>
+            </w:pPr>
+            <w:r>
+              <w:rPr>
+                <w:sz w:val="19"/>
+              </w:rPr>
+              <w:t>Activity Log</w:t>
+            </w:r>
+          </w:p>
+        </w:tc>
+        <w:tc>
+          <w:tcPr>
+            <w:tcW w:type="dxa" w:w="5040"/>
+            <w:shd w:val="clear" w:color="auto" w:fill="FFFFFF"/>
+          </w:tcPr>
+          <w:p>
+            <w:pPr>
+              <w:spacing w:before="60" w:after="60"/>
+            </w:pPr>
+            <w:r>
+              <w:rPr>
+                <w:sz w:val="19"/>
+              </w:rPr>
+              <w:t>Last 500 audit log entries: timestamps, users, actions, diff payloads.</w:t>
+            </w:r>
+          </w:p>
+        </w:tc>
+        <w:tc>
+          <w:tcPr>
+            <w:tcW w:type="dxa" w:w="2016"/>
+            <w:shd w:val="clear" w:color="auto" w:fill="FFFFFF"/>
+          </w:tcPr>
+          <w:p>
+            <w:pPr>
+              <w:spacing w:before="60" w:after="60"/>
+            </w:pPr>
+            <w:r>
+              <w:rPr>
+                <w:sz w:val="19"/>
+              </w:rPr>
+              <w:t>No</w:t>
+            </w:r>
+          </w:p>
+        </w:tc>
+      </w:tr>
+      <w:tr>
+        <w:tc>
+          <w:tcPr>
+            <w:tcW w:type="dxa" w:w="2160"/>
+            <w:shd w:val="clear" w:color="auto" w:fill="F8F9FA"/>
+          </w:tcPr>
+          <w:p>
+            <w:pPr>
+              <w:spacing w:before="60" w:after="60"/>
+            </w:pPr>
+            <w:r>
+              <w:rPr>
+                <w:sz w:val="19"/>
+              </w:rPr>
+              <w:t>Baselines</w:t>
+            </w:r>
+          </w:p>
+        </w:tc>
+        <w:tc>
+          <w:tcPr>
+            <w:tcW w:type="dxa" w:w="5040"/>
+            <w:shd w:val="clear" w:color="auto" w:fill="F8F9FA"/>
+          </w:tcPr>
+          <w:p>
+            <w:pPr>
+              <w:spacing w:before="60" w:after="60"/>
+            </w:pPr>
+            <w:r>
+              <w:rPr>
+                <w:sz w:val="19"/>
+              </w:rPr>
+              <w:t>All captured baseline snapshots with per-task variance calculations.</w:t>
+            </w:r>
+          </w:p>
+        </w:tc>
+        <w:tc>
+          <w:tcPr>
+            <w:tcW w:type="dxa" w:w="2016"/>
+            <w:shd w:val="clear" w:color="auto" w:fill="F8F9FA"/>
+          </w:tcPr>
+          <w:p>
+            <w:pPr>
+              <w:spacing w:before="60" w:after="60"/>
+            </w:pPr>
+            <w:r>
+              <w:rPr>
+                <w:sz w:val="19"/>
+              </w:rPr>
+              <w:t>Yes (variance)</w:t>
+            </w:r>
+          </w:p>
+        </w:tc>
+      </w:tr>
+      <w:tr>
+        <w:tc>
+          <w:tcPr>
+            <w:tcW w:type="dxa" w:w="2160"/>
+            <w:shd w:val="clear" w:color="auto" w:fill="FFFFFF"/>
+          </w:tcPr>
+          <w:p>
+            <w:pPr>
+              <w:spacing w:before="60" w:after="60"/>
+            </w:pPr>
+            <w:r>
+              <w:rPr>
+                <w:sz w:val="19"/>
+              </w:rPr>
+              <w:t>Releases</w:t>
+            </w:r>
+          </w:p>
+        </w:tc>
+        <w:tc>
+          <w:tcPr>
+            <w:tcW w:type="dxa" w:w="5040"/>
+            <w:shd w:val="clear" w:color="auto" w:fill="FFFFFF"/>
+          </w:tcPr>
+          <w:p>
+            <w:pPr>
+              <w:spacing w:before="60" w:after="60"/>
+            </w:pPr>
+            <w:r>
+              <w:rPr>
+                <w:sz w:val="19"/>
+              </w:rPr>
+              <w:t>Release version registry with status and target dates.</w:t>
+            </w:r>
+          </w:p>
+        </w:tc>
+        <w:tc>
+          <w:tcPr>
+            <w:tcW w:type="dxa" w:w="2016"/>
+            <w:shd w:val="clear" w:color="auto" w:fill="FFFFFF"/>
+          </w:tcPr>
+          <w:p>
+            <w:pPr>
+              <w:spacing w:before="60" w:after="60"/>
+            </w:pPr>
+            <w:r>
+              <w:rPr>
+                <w:sz w:val="19"/>
+              </w:rPr>
+              <w:t>No</w:t>
             </w:r>
           </w:p>
         </w:tc>
@@ -20967,21 +22410,6 @@
       <w:pPr>
         <w:spacing w:after="120"/>
       </w:pPr>
-    </w:p>
-    <w:p>
-      <w:pPr>
-        <w:spacing w:before="120" w:after="160"/>
-        <w:ind w:left="576"/>
-      </w:pPr>
-      <w:r>
-        <w:rPr>
-          <w:rFonts w:ascii="Courier New" w:hAnsi="Courier New"/>
-          <w:b/>
-          <w:color w:val="1E9ED5"/>
-          <w:sz w:val="21"/>
-        </w:rPr>
-        <w:t>healthDefectPenalty = (s1count*10) + (s2count*5) + (s3count*2) + (s4count*0.5)</w:t>
-      </w:r>
     </w:p>
     <w:p>
       <w:pPr>
@@ -20992,7 +22420,7 @@
         <w:rPr>
           <w:color w:val="1E9ED5"/>
         </w:rPr>
-        <w:t>13.2  Defect Status Lifecycle</w:t>
+        <w:t>14.3  Excel Cell Colour Coding Rules</w:t>
       </w:r>
     </w:p>
     <w:tbl>
@@ -21011,8 +22439,8 @@
       <w:tr>
         <w:tc>
           <w:tcPr>
-            <w:tcW w:type="dxa" w:w="2160"/>
-            <w:shd w:val="clear" w:color="auto" w:fill="1A1A2E"/>
+            <w:tcW w:type="dxa" w:w="1440"/>
+            <w:shd w:val="clear" w:color="auto" w:fill="0D1B2A"/>
           </w:tcPr>
           <w:p>
             <w:pPr>
@@ -21024,14 +22452,14 @@
                 <w:color w:val="FFFFFF"/>
                 <w:sz w:val="19"/>
               </w:rPr>
-              <w:t>From Status</w:t>
+              <w:t>Colour</w:t>
             </w:r>
           </w:p>
         </w:tc>
         <w:tc>
           <w:tcPr>
             <w:tcW w:type="dxa" w:w="2160"/>
-            <w:shd w:val="clear" w:color="auto" w:fill="1A1A2E"/>
+            <w:shd w:val="clear" w:color="auto" w:fill="0D1B2A"/>
           </w:tcPr>
           <w:p>
             <w:pPr>
@@ -21043,14 +22471,14 @@
                 <w:color w:val="FFFFFF"/>
                 <w:sz w:val="19"/>
               </w:rPr>
-              <w:t>To Status</w:t>
-            </w:r>
-          </w:p>
-        </w:tc>
-        <w:tc>
-          <w:tcPr>
-            <w:tcW w:type="dxa" w:w="3168"/>
-            <w:shd w:val="clear" w:color="auto" w:fill="1A1A2E"/>
+              <w:t>Background Hex</w:t>
+            </w:r>
+          </w:p>
+        </w:tc>
+        <w:tc>
+          <w:tcPr>
+            <w:tcW w:type="dxa" w:w="1728"/>
+            <w:shd w:val="clear" w:color="auto" w:fill="0D1B2A"/>
           </w:tcPr>
           <w:p>
             <w:pPr>
@@ -21062,14 +22490,14 @@
                 <w:color w:val="FFFFFF"/>
                 <w:sz w:val="19"/>
               </w:rPr>
-              <w:t>Guard / Condition</w:t>
-            </w:r>
-          </w:p>
-        </w:tc>
-        <w:tc>
-          <w:tcPr>
-            <w:tcW w:type="dxa" w:w="2016"/>
-            <w:shd w:val="clear" w:color="auto" w:fill="1A1A2E"/>
+              <w:t>Text Hex</w:t>
+            </w:r>
+          </w:p>
+        </w:tc>
+        <w:tc>
+          <w:tcPr>
+            <w:tcW w:type="dxa" w:w="4176"/>
+            <w:shd w:val="clear" w:color="auto" w:fill="0D1B2A"/>
           </w:tcPr>
           <w:p>
             <w:pPr>
@@ -21081,7 +22509,7 @@
                 <w:color w:val="FFFFFF"/>
                 <w:sz w:val="19"/>
               </w:rPr>
-              <w:t>Required Effect</w:t>
+              <w:t>Applied When</w:t>
             </w:r>
           </w:p>
         </w:tc>
@@ -21089,6 +22517,23 @@
       <w:tr>
         <w:tc>
           <w:tcPr>
+            <w:tcW w:type="dxa" w:w="1440"/>
+            <w:shd w:val="clear" w:color="auto" w:fill="F8F9FA"/>
+          </w:tcPr>
+          <w:p>
+            <w:pPr>
+              <w:spacing w:before="60" w:after="60"/>
+            </w:pPr>
+            <w:r>
+              <w:rPr>
+                <w:sz w:val="19"/>
+              </w:rPr>
+              <w:t>Green</w:t>
+            </w:r>
+          </w:p>
+        </w:tc>
+        <w:tc>
+          <w:tcPr>
             <w:tcW w:type="dxa" w:w="2160"/>
             <w:shd w:val="clear" w:color="auto" w:fill="F8F9FA"/>
           </w:tcPr>
@@ -21100,58 +22545,41 @@
               <w:rPr>
                 <w:sz w:val="19"/>
               </w:rPr>
-              <w:t>New</w:t>
-            </w:r>
-          </w:p>
-        </w:tc>
-        <w:tc>
-          <w:tcPr>
-            <w:tcW w:type="dxa" w:w="2160"/>
-            <w:shd w:val="clear" w:color="auto" w:fill="F8F9FA"/>
-          </w:tcPr>
-          <w:p>
-            <w:pPr>
-              <w:spacing w:before="60" w:after="60"/>
-            </w:pPr>
-            <w:r>
-              <w:rPr>
-                <w:sz w:val="19"/>
-              </w:rPr>
-              <w:t>Assigned</w:t>
-            </w:r>
-          </w:p>
-        </w:tc>
-        <w:tc>
-          <w:tcPr>
-            <w:tcW w:type="dxa" w:w="3168"/>
-            <w:shd w:val="clear" w:color="auto" w:fill="F8F9FA"/>
-          </w:tcPr>
-          <w:p>
-            <w:pPr>
-              <w:spacing w:before="60" w:after="60"/>
-            </w:pPr>
-            <w:r>
-              <w:rPr>
-                <w:sz w:val="19"/>
-              </w:rPr>
-              <w:t>Owner allocated by Engineering Manager</w:t>
-            </w:r>
-          </w:p>
-        </w:tc>
-        <w:tc>
-          <w:tcPr>
-            <w:tcW w:type="dxa" w:w="2016"/>
-            <w:shd w:val="clear" w:color="auto" w:fill="F8F9FA"/>
-          </w:tcPr>
-          <w:p>
-            <w:pPr>
-              <w:spacing w:before="60" w:after="60"/>
-            </w:pPr>
-            <w:r>
-              <w:rPr>
-                <w:sz w:val="19"/>
-              </w:rPr>
-              <w:t>Log Status Changed. Notify assignee.</w:t>
+              <w:t>#D1E7DD</w:t>
+            </w:r>
+          </w:p>
+        </w:tc>
+        <w:tc>
+          <w:tcPr>
+            <w:tcW w:type="dxa" w:w="1728"/>
+            <w:shd w:val="clear" w:color="auto" w:fill="F8F9FA"/>
+          </w:tcPr>
+          <w:p>
+            <w:pPr>
+              <w:spacing w:before="60" w:after="60"/>
+            </w:pPr>
+            <w:r>
+              <w:rPr>
+                <w:sz w:val="19"/>
+              </w:rPr>
+              <w:t>#0F5132</w:t>
+            </w:r>
+          </w:p>
+        </w:tc>
+        <w:tc>
+          <w:tcPr>
+            <w:tcW w:type="dxa" w:w="4176"/>
+            <w:shd w:val="clear" w:color="auto" w:fill="F8F9FA"/>
+          </w:tcPr>
+          <w:p>
+            <w:pPr>
+              <w:spacing w:before="60" w:after="60"/>
+            </w:pPr>
+            <w:r>
+              <w:rPr>
+                <w:sz w:val="19"/>
+              </w:rPr>
+              <w:t>Status = Completed / Closed / Mitigated / Low RAID exposure.</w:t>
             </w:r>
           </w:p>
         </w:tc>
@@ -21159,6 +22587,23 @@
       <w:tr>
         <w:tc>
           <w:tcPr>
+            <w:tcW w:type="dxa" w:w="1440"/>
+            <w:shd w:val="clear" w:color="auto" w:fill="FFFFFF"/>
+          </w:tcPr>
+          <w:p>
+            <w:pPr>
+              <w:spacing w:before="60" w:after="60"/>
+            </w:pPr>
+            <w:r>
+              <w:rPr>
+                <w:sz w:val="19"/>
+              </w:rPr>
+              <w:t>Yellow</w:t>
+            </w:r>
+          </w:p>
+        </w:tc>
+        <w:tc>
+          <w:tcPr>
             <w:tcW w:type="dxa" w:w="2160"/>
             <w:shd w:val="clear" w:color="auto" w:fill="FFFFFF"/>
           </w:tcPr>
@@ -21170,7 +22615,130 @@
               <w:rPr>
                 <w:sz w:val="19"/>
               </w:rPr>
-              <w:t>Assigned</w:t>
+              <w:t>#FFF3CD</w:t>
+            </w:r>
+          </w:p>
+        </w:tc>
+        <w:tc>
+          <w:tcPr>
+            <w:tcW w:type="dxa" w:w="1728"/>
+            <w:shd w:val="clear" w:color="auto" w:fill="FFFFFF"/>
+          </w:tcPr>
+          <w:p>
+            <w:pPr>
+              <w:spacing w:before="60" w:after="60"/>
+            </w:pPr>
+            <w:r>
+              <w:rPr>
+                <w:sz w:val="19"/>
+              </w:rPr>
+              <w:t>#664D03</w:t>
+            </w:r>
+          </w:p>
+        </w:tc>
+        <w:tc>
+          <w:tcPr>
+            <w:tcW w:type="dxa" w:w="4176"/>
+            <w:shd w:val="clear" w:color="auto" w:fill="FFFFFF"/>
+          </w:tcPr>
+          <w:p>
+            <w:pPr>
+              <w:spacing w:before="60" w:after="60"/>
+            </w:pPr>
+            <w:r>
+              <w:rPr>
+                <w:sz w:val="19"/>
+              </w:rPr>
+              <w:t>Status = In Progress / Under Review / Medium risk / Deferred.</w:t>
+            </w:r>
+          </w:p>
+        </w:tc>
+      </w:tr>
+      <w:tr>
+        <w:tc>
+          <w:tcPr>
+            <w:tcW w:type="dxa" w:w="1440"/>
+            <w:shd w:val="clear" w:color="auto" w:fill="F8F9FA"/>
+          </w:tcPr>
+          <w:p>
+            <w:pPr>
+              <w:spacing w:before="60" w:after="60"/>
+            </w:pPr>
+            <w:r>
+              <w:rPr>
+                <w:sz w:val="19"/>
+              </w:rPr>
+              <w:t>Red</w:t>
+            </w:r>
+          </w:p>
+        </w:tc>
+        <w:tc>
+          <w:tcPr>
+            <w:tcW w:type="dxa" w:w="2160"/>
+            <w:shd w:val="clear" w:color="auto" w:fill="F8F9FA"/>
+          </w:tcPr>
+          <w:p>
+            <w:pPr>
+              <w:spacing w:before="60" w:after="60"/>
+            </w:pPr>
+            <w:r>
+              <w:rPr>
+                <w:sz w:val="19"/>
+              </w:rPr>
+              <w:t>#F8D7DA</w:t>
+            </w:r>
+          </w:p>
+        </w:tc>
+        <w:tc>
+          <w:tcPr>
+            <w:tcW w:type="dxa" w:w="1728"/>
+            <w:shd w:val="clear" w:color="auto" w:fill="F8F9FA"/>
+          </w:tcPr>
+          <w:p>
+            <w:pPr>
+              <w:spacing w:before="60" w:after="60"/>
+            </w:pPr>
+            <w:r>
+              <w:rPr>
+                <w:sz w:val="19"/>
+              </w:rPr>
+              <w:t>#842029</w:t>
+            </w:r>
+          </w:p>
+        </w:tc>
+        <w:tc>
+          <w:tcPr>
+            <w:tcW w:type="dxa" w:w="4176"/>
+            <w:shd w:val="clear" w:color="auto" w:fill="F8F9FA"/>
+          </w:tcPr>
+          <w:p>
+            <w:pPr>
+              <w:spacing w:before="60" w:after="60"/>
+            </w:pPr>
+            <w:r>
+              <w:rPr>
+                <w:sz w:val="19"/>
+              </w:rPr>
+              <w:t>Status = Blocked / Overdue / Critical risk / S1-S2 Defect.</w:t>
+            </w:r>
+          </w:p>
+        </w:tc>
+      </w:tr>
+      <w:tr>
+        <w:tc>
+          <w:tcPr>
+            <w:tcW w:type="dxa" w:w="1440"/>
+            <w:shd w:val="clear" w:color="auto" w:fill="FFFFFF"/>
+          </w:tcPr>
+          <w:p>
+            <w:pPr>
+              <w:spacing w:before="60" w:after="60"/>
+            </w:pPr>
+            <w:r>
+              <w:rPr>
+                <w:sz w:val="19"/>
+              </w:rPr>
+              <w:t>Grey</w:t>
             </w:r>
           </w:p>
         </w:tc>
@@ -21187,13 +22755,13 @@
               <w:rPr>
                 <w:sz w:val="19"/>
               </w:rPr>
-              <w:t>Fixed</w:t>
-            </w:r>
-          </w:p>
-        </w:tc>
-        <w:tc>
-          <w:tcPr>
-            <w:tcW w:type="dxa" w:w="3168"/>
+              <w:t>#F8F9FA</w:t>
+            </w:r>
+          </w:p>
+        </w:tc>
+        <w:tc>
+          <w:tcPr>
+            <w:tcW w:type="dxa" w:w="1728"/>
             <w:shd w:val="clear" w:color="auto" w:fill="FFFFFF"/>
           </w:tcPr>
           <w:p>
@@ -21204,13 +22772,13 @@
               <w:rPr>
                 <w:sz w:val="19"/>
               </w:rPr>
-              <w:t>Developer applies code fix</w:t>
-            </w:r>
-          </w:p>
-        </w:tc>
-        <w:tc>
-          <w:tcPr>
-            <w:tcW w:type="dxa" w:w="2016"/>
+              <w:t>#6C757D</w:t>
+            </w:r>
+          </w:p>
+        </w:tc>
+        <w:tc>
+          <w:tcPr>
+            <w:tcW w:type="dxa" w:w="4176"/>
             <w:shd w:val="clear" w:color="auto" w:fill="FFFFFF"/>
           </w:tcPr>
           <w:p>
@@ -21221,427 +22789,7 @@
               <w:rPr>
                 <w:sz w:val="19"/>
               </w:rPr>
-              <w:t>Log Status Changed. SLA timer stops.</w:t>
-            </w:r>
-          </w:p>
-        </w:tc>
-      </w:tr>
-      <w:tr>
-        <w:tc>
-          <w:tcPr>
-            <w:tcW w:type="dxa" w:w="2160"/>
-            <w:shd w:val="clear" w:color="auto" w:fill="F8F9FA"/>
-          </w:tcPr>
-          <w:p>
-            <w:pPr>
-              <w:spacing w:before="60" w:after="60"/>
-            </w:pPr>
-            <w:r>
-              <w:rPr>
-                <w:sz w:val="19"/>
-              </w:rPr>
-              <w:t>Fixed</w:t>
-            </w:r>
-          </w:p>
-        </w:tc>
-        <w:tc>
-          <w:tcPr>
-            <w:tcW w:type="dxa" w:w="2160"/>
-            <w:shd w:val="clear" w:color="auto" w:fill="F8F9FA"/>
-          </w:tcPr>
-          <w:p>
-            <w:pPr>
-              <w:spacing w:before="60" w:after="60"/>
-            </w:pPr>
-            <w:r>
-              <w:rPr>
-                <w:sz w:val="19"/>
-              </w:rPr>
-              <w:t>Retest</w:t>
-            </w:r>
-          </w:p>
-        </w:tc>
-        <w:tc>
-          <w:tcPr>
-            <w:tcW w:type="dxa" w:w="3168"/>
-            <w:shd w:val="clear" w:color="auto" w:fill="F8F9FA"/>
-          </w:tcPr>
-          <w:p>
-            <w:pPr>
-              <w:spacing w:before="60" w:after="60"/>
-            </w:pPr>
-            <w:r>
-              <w:rPr>
-                <w:sz w:val="19"/>
-              </w:rPr>
-              <w:t>Fix deployed to test environment</w:t>
-            </w:r>
-          </w:p>
-        </w:tc>
-        <w:tc>
-          <w:tcPr>
-            <w:tcW w:type="dxa" w:w="2016"/>
-            <w:shd w:val="clear" w:color="auto" w:fill="F8F9FA"/>
-          </w:tcPr>
-          <w:p>
-            <w:pPr>
-              <w:spacing w:before="60" w:after="60"/>
-            </w:pPr>
-            <w:r>
-              <w:rPr>
-                <w:sz w:val="19"/>
-              </w:rPr>
-              <w:t>Log Status Changed. Notify QA.</w:t>
-            </w:r>
-          </w:p>
-        </w:tc>
-      </w:tr>
-      <w:tr>
-        <w:tc>
-          <w:tcPr>
-            <w:tcW w:type="dxa" w:w="2160"/>
-            <w:shd w:val="clear" w:color="auto" w:fill="FFFFFF"/>
-          </w:tcPr>
-          <w:p>
-            <w:pPr>
-              <w:spacing w:before="60" w:after="60"/>
-            </w:pPr>
-            <w:r>
-              <w:rPr>
-                <w:sz w:val="19"/>
-              </w:rPr>
-              <w:t>Retest</w:t>
-            </w:r>
-          </w:p>
-        </w:tc>
-        <w:tc>
-          <w:tcPr>
-            <w:tcW w:type="dxa" w:w="2160"/>
-            <w:shd w:val="clear" w:color="auto" w:fill="FFFFFF"/>
-          </w:tcPr>
-          <w:p>
-            <w:pPr>
-              <w:spacing w:before="60" w:after="60"/>
-            </w:pPr>
-            <w:r>
-              <w:rPr>
-                <w:sz w:val="19"/>
-              </w:rPr>
-              <w:t>Closed</w:t>
-            </w:r>
-          </w:p>
-        </w:tc>
-        <w:tc>
-          <w:tcPr>
-            <w:tcW w:type="dxa" w:w="3168"/>
-            <w:shd w:val="clear" w:color="auto" w:fill="FFFFFF"/>
-          </w:tcPr>
-          <w:p>
-            <w:pPr>
-              <w:spacing w:before="60" w:after="60"/>
-            </w:pPr>
-            <w:r>
-              <w:rPr>
-                <w:sz w:val="19"/>
-              </w:rPr>
-              <w:t>QA verifies fix is correct</w:t>
-            </w:r>
-          </w:p>
-        </w:tc>
-        <w:tc>
-          <w:tcPr>
-            <w:tcW w:type="dxa" w:w="2016"/>
-            <w:shd w:val="clear" w:color="auto" w:fill="FFFFFF"/>
-          </w:tcPr>
-          <w:p>
-            <w:pPr>
-              <w:spacing w:before="60" w:after="60"/>
-            </w:pPr>
-            <w:r>
-              <w:rPr>
-                <w:sz w:val="19"/>
-              </w:rPr>
-              <w:t>Set closedDate. Health penalty removed.</w:t>
-            </w:r>
-          </w:p>
-        </w:tc>
-      </w:tr>
-      <w:tr>
-        <w:tc>
-          <w:tcPr>
-            <w:tcW w:type="dxa" w:w="2160"/>
-            <w:shd w:val="clear" w:color="auto" w:fill="F8F9FA"/>
-          </w:tcPr>
-          <w:p>
-            <w:pPr>
-              <w:spacing w:before="60" w:after="60"/>
-            </w:pPr>
-            <w:r>
-              <w:rPr>
-                <w:sz w:val="19"/>
-              </w:rPr>
-              <w:t>Retest</w:t>
-            </w:r>
-          </w:p>
-        </w:tc>
-        <w:tc>
-          <w:tcPr>
-            <w:tcW w:type="dxa" w:w="2160"/>
-            <w:shd w:val="clear" w:color="auto" w:fill="F8F9FA"/>
-          </w:tcPr>
-          <w:p>
-            <w:pPr>
-              <w:spacing w:before="60" w:after="60"/>
-            </w:pPr>
-            <w:r>
-              <w:rPr>
-                <w:sz w:val="19"/>
-              </w:rPr>
-              <w:t>Assigned</w:t>
-            </w:r>
-          </w:p>
-        </w:tc>
-        <w:tc>
-          <w:tcPr>
-            <w:tcW w:type="dxa" w:w="3168"/>
-            <w:shd w:val="clear" w:color="auto" w:fill="F8F9FA"/>
-          </w:tcPr>
-          <w:p>
-            <w:pPr>
-              <w:spacing w:before="60" w:after="60"/>
-            </w:pPr>
-            <w:r>
-              <w:rPr>
-                <w:sz w:val="19"/>
-              </w:rPr>
-              <w:t>QA finds fix incomplete (re-open)</w:t>
-            </w:r>
-          </w:p>
-        </w:tc>
-        <w:tc>
-          <w:tcPr>
-            <w:tcW w:type="dxa" w:w="2016"/>
-            <w:shd w:val="clear" w:color="auto" w:fill="F8F9FA"/>
-          </w:tcPr>
-          <w:p>
-            <w:pPr>
-              <w:spacing w:before="60" w:after="60"/>
-            </w:pPr>
-            <w:r>
-              <w:rPr>
-                <w:sz w:val="19"/>
-              </w:rPr>
-              <w:t>Log Status Changed. Notify developer.</w:t>
-            </w:r>
-          </w:p>
-        </w:tc>
-      </w:tr>
-      <w:tr>
-        <w:tc>
-          <w:tcPr>
-            <w:tcW w:type="dxa" w:w="2160"/>
-            <w:shd w:val="clear" w:color="auto" w:fill="FFFFFF"/>
-          </w:tcPr>
-          <w:p>
-            <w:pPr>
-              <w:spacing w:before="60" w:after="60"/>
-            </w:pPr>
-            <w:r>
-              <w:rPr>
-                <w:sz w:val="19"/>
-              </w:rPr>
-              <w:t>New</w:t>
-            </w:r>
-          </w:p>
-        </w:tc>
-        <w:tc>
-          <w:tcPr>
-            <w:tcW w:type="dxa" w:w="2160"/>
-            <w:shd w:val="clear" w:color="auto" w:fill="FFFFFF"/>
-          </w:tcPr>
-          <w:p>
-            <w:pPr>
-              <w:spacing w:before="60" w:after="60"/>
-            </w:pPr>
-            <w:r>
-              <w:rPr>
-                <w:sz w:val="19"/>
-              </w:rPr>
-              <w:t>Rejected</w:t>
-            </w:r>
-          </w:p>
-        </w:tc>
-        <w:tc>
-          <w:tcPr>
-            <w:tcW w:type="dxa" w:w="3168"/>
-            <w:shd w:val="clear" w:color="auto" w:fill="FFFFFF"/>
-          </w:tcPr>
-          <w:p>
-            <w:pPr>
-              <w:spacing w:before="60" w:after="60"/>
-            </w:pPr>
-            <w:r>
-              <w:rPr>
-                <w:sz w:val="19"/>
-              </w:rPr>
-              <w:t>Defect is by design or not reproducible</w:t>
-            </w:r>
-          </w:p>
-        </w:tc>
-        <w:tc>
-          <w:tcPr>
-            <w:tcW w:type="dxa" w:w="2016"/>
-            <w:shd w:val="clear" w:color="auto" w:fill="FFFFFF"/>
-          </w:tcPr>
-          <w:p>
-            <w:pPr>
-              <w:spacing w:before="60" w:after="60"/>
-            </w:pPr>
-            <w:r>
-              <w:rPr>
-                <w:sz w:val="19"/>
-              </w:rPr>
-              <w:t>Set closedDate. Log rejection reason.</w:t>
-            </w:r>
-          </w:p>
-        </w:tc>
-      </w:tr>
-      <w:tr>
-        <w:tc>
-          <w:tcPr>
-            <w:tcW w:type="dxa" w:w="2160"/>
-            <w:shd w:val="clear" w:color="auto" w:fill="F8F9FA"/>
-          </w:tcPr>
-          <w:p>
-            <w:pPr>
-              <w:spacing w:before="60" w:after="60"/>
-            </w:pPr>
-            <w:r>
-              <w:rPr>
-                <w:sz w:val="19"/>
-              </w:rPr>
-              <w:t>Assigned</w:t>
-            </w:r>
-          </w:p>
-        </w:tc>
-        <w:tc>
-          <w:tcPr>
-            <w:tcW w:type="dxa" w:w="2160"/>
-            <w:shd w:val="clear" w:color="auto" w:fill="F8F9FA"/>
-          </w:tcPr>
-          <w:p>
-            <w:pPr>
-              <w:spacing w:before="60" w:after="60"/>
-            </w:pPr>
-            <w:r>
-              <w:rPr>
-                <w:sz w:val="19"/>
-              </w:rPr>
-              <w:t>Rejected</w:t>
-            </w:r>
-          </w:p>
-        </w:tc>
-        <w:tc>
-          <w:tcPr>
-            <w:tcW w:type="dxa" w:w="3168"/>
-            <w:shd w:val="clear" w:color="auto" w:fill="F8F9FA"/>
-          </w:tcPr>
-          <w:p>
-            <w:pPr>
-              <w:spacing w:before="60" w:after="60"/>
-            </w:pPr>
-            <w:r>
-              <w:rPr>
-                <w:sz w:val="19"/>
-              </w:rPr>
-              <w:t>Investigation reveals non-defect</w:t>
-            </w:r>
-          </w:p>
-        </w:tc>
-        <w:tc>
-          <w:tcPr>
-            <w:tcW w:type="dxa" w:w="2016"/>
-            <w:shd w:val="clear" w:color="auto" w:fill="F8F9FA"/>
-          </w:tcPr>
-          <w:p>
-            <w:pPr>
-              <w:spacing w:before="60" w:after="60"/>
-            </w:pPr>
-            <w:r>
-              <w:rPr>
-                <w:sz w:val="19"/>
-              </w:rPr>
-              <w:t>Set closedDate. Log rejection reason.</w:t>
-            </w:r>
-          </w:p>
-        </w:tc>
-      </w:tr>
-      <w:tr>
-        <w:tc>
-          <w:tcPr>
-            <w:tcW w:type="dxa" w:w="2160"/>
-            <w:shd w:val="clear" w:color="auto" w:fill="FFFFFF"/>
-          </w:tcPr>
-          <w:p>
-            <w:pPr>
-              <w:spacing w:before="60" w:after="60"/>
-            </w:pPr>
-            <w:r>
-              <w:rPr>
-                <w:sz w:val="19"/>
-              </w:rPr>
-              <w:t>Assigned</w:t>
-            </w:r>
-          </w:p>
-        </w:tc>
-        <w:tc>
-          <w:tcPr>
-            <w:tcW w:type="dxa" w:w="2160"/>
-            <w:shd w:val="clear" w:color="auto" w:fill="FFFFFF"/>
-          </w:tcPr>
-          <w:p>
-            <w:pPr>
-              <w:spacing w:before="60" w:after="60"/>
-            </w:pPr>
-            <w:r>
-              <w:rPr>
-                <w:sz w:val="19"/>
-              </w:rPr>
-              <w:t>Deferred</w:t>
-            </w:r>
-          </w:p>
-        </w:tc>
-        <w:tc>
-          <w:tcPr>
-            <w:tcW w:type="dxa" w:w="3168"/>
-            <w:shd w:val="clear" w:color="auto" w:fill="FFFFFF"/>
-          </w:tcPr>
-          <w:p>
-            <w:pPr>
-              <w:spacing w:before="60" w:after="60"/>
-            </w:pPr>
-            <w:r>
-              <w:rPr>
-                <w:sz w:val="19"/>
-              </w:rPr>
-              <w:t>Fix postponed to future release</w:t>
-            </w:r>
-          </w:p>
-        </w:tc>
-        <w:tc>
-          <w:tcPr>
-            <w:tcW w:type="dxa" w:w="2016"/>
-            <w:shd w:val="clear" w:color="auto" w:fill="FFFFFF"/>
-          </w:tcPr>
-          <w:p>
-            <w:pPr>
-              <w:spacing w:before="60" w:after="60"/>
-            </w:pPr>
-            <w:r>
-              <w:rPr>
-                <w:sz w:val="19"/>
-              </w:rPr>
-              <w:t>Log Status Changed with release target.</w:t>
+              <w:t>Status = Cancelled / Rejected / On Hold / Departed member.</w:t>
             </w:r>
           </w:p>
         </w:tc>
@@ -21652,78 +22800,58 @@
         <w:spacing w:after="120"/>
       </w:pPr>
     </w:p>
-    <w:p>
-      <w:pPr>
-        <w:pStyle w:val="Heading2"/>
-        <w:spacing w:before="360" w:after="120"/>
-      </w:pPr>
-      <w:r>
-        <w:rPr>
-          <w:color w:val="1E9ED5"/>
-        </w:rPr>
-        <w:t>13.3  S1 Blocker Escalation Workflow</w:t>
-      </w:r>
-    </w:p>
-    <w:p>
-      <w:pPr>
-        <w:pStyle w:val="ListNumber"/>
-        <w:spacing w:before="0" w:after="60"/>
-      </w:pPr>
-      <w:r>
-        <w:rPr>
-          <w:sz w:val="21"/>
-        </w:rPr>
-        <w:t>S1 Blocker logged: Red alert banner immediately appears on Overview Dashboard.</w:t>
-      </w:r>
-    </w:p>
-    <w:p>
-      <w:pPr>
-        <w:pStyle w:val="ListNumber"/>
-        <w:spacing w:before="0" w:after="60"/>
-      </w:pPr>
-      <w:r>
-        <w:rPr>
-          <w:sz w:val="21"/>
-        </w:rPr>
-        <w:t>24-hour SLA countdown timer starts from defect creation timestamp.</w:t>
-      </w:r>
-    </w:p>
-    <w:p>
-      <w:pPr>
-        <w:pStyle w:val="ListNumber"/>
-        <w:spacing w:before="0" w:after="60"/>
-      </w:pPr>
-      <w:r>
-        <w:rPr>
-          <w:sz w:val="21"/>
-        </w:rPr>
-        <w:t>If defect remains in New or Assigned status after 24 hours: in-app notification sent to Engineering Manager.</w:t>
-      </w:r>
-    </w:p>
-    <w:p>
-      <w:pPr>
-        <w:pStyle w:val="ListNumber"/>
-        <w:spacing w:before="0" w:after="60"/>
-      </w:pPr>
-      <w:r>
-        <w:rPr>
-          <w:sz w:val="21"/>
-        </w:rPr>
-        <w:t>SLA breach is flagged in the Defect Tracker with a red SLA badge.</w:t>
-      </w:r>
-    </w:p>
-    <w:p>
-      <w:pPr>
-        <w:pStyle w:val="ListNumber"/>
-        <w:spacing w:before="0" w:after="60"/>
-      </w:pPr>
-      <w:r>
-        <w:rPr>
-          <w:sz w:val="21"/>
-        </w:rPr>
-        <w:t>Defect remains flagged until status transitions to Fixed or beyond.</w:t>
-      </w:r>
-    </w:p>
+    <w:tbl>
+      <w:tblPr>
+        <w:tblStyle w:val="TableGrid"/>
+        <w:tblW w:type="auto" w:w="0"/>
+        <w:jc w:val="center"/>
+        <w:tblLook w:firstColumn="1" w:firstRow="1" w:lastColumn="0" w:lastRow="0" w:noHBand="0" w:noVBand="1" w:val="04A0"/>
+      </w:tblPr>
+      <w:tblGrid>
+        <w:gridCol w:w="9072"/>
+      </w:tblGrid>
+      <w:tr>
+        <w:tc>
+          <w:tcPr>
+            <w:tcW w:type="dxa" w:w="9072"/>
+            <w:shd w:val="clear" w:color="auto" w:fill="E9F7EF"/>
+            <w:tcBorders>
+              <w:left w:val="single" w:sz="18" w:color="1E8449"/>
+              <w:top w:val="single" w:sz="4" w:color="FFFFFF"/>
+              <w:right w:val="single" w:sz="4" w:color="FFFFFF"/>
+              <w:bottom w:val="single" w:sz="4" w:color="FFFFFF"/>
+            </w:tcBorders>
+          </w:tcPr>
+          <w:p>
+            <w:pPr>
+              <w:spacing w:before="120" w:after="40"/>
+              <w:ind w:left="144"/>
+            </w:pPr>
+            <w:r>
+              <w:rPr>
+                <w:b/>
+                <w:color w:val="145A32"/>
+                <w:sz w:val="18"/>
+              </w:rPr>
+              <w:t xml:space="preserve">[TIP]  </w:t>
+            </w:r>
+          </w:p>
+          <w:p>
+            <w:pPr>
+              <w:spacing w:before="40" w:after="120"/>
+              <w:ind w:left="144"/>
+            </w:pPr>
+            <w:r>
+              <w:rPr>
+                <w:sz w:val="20"/>
+              </w:rPr>
+              <w:t>Excel cells in the Tasks sheet contain live formulas for Variance Days and Effort Variance. Stakeholders can modify the workbook after export without breaking these calculations.</w:t>
+            </w:r>
+          </w:p>
+        </w:tc>
+      </w:tr>
+    </w:tbl>
+    <w:p/>
     <w:p>
       <w:r>
         <w:br w:type="page"/>
@@ -21738,7 +22866,7 @@
         <w:rPr>
           <w:color w:val="0D1B2A"/>
         </w:rPr>
-        <w:t>14  Reports &amp; Board Packs</w:t>
+        <w:t>15  Audit Log &amp; Activity Streams</w:t>
       </w:r>
     </w:p>
     <w:p>
@@ -21757,7 +22885,7 @@
         <w:rPr>
           <w:sz w:val="21"/>
         </w:rPr>
-        <w:t>The Reports module provides one-click generation of an Executive Board Pack and a professional multi-sheet Excel workbook export with live formulas.</w:t>
+        <w:t>The Audit Log provides a complete, immutable, chronological record of every state mutation in the application. It is append-only and forms the basis for both accountability reporting and session rollback.</w:t>
       </w:r>
     </w:p>
     <w:p>
@@ -21769,7 +22897,7 @@
         <w:drawing>
           <wp:inline xmlns:a="http://schemas.openxmlformats.org/drawingml/2006/main" xmlns:pic="http://schemas.openxmlformats.org/drawingml/2006/picture">
             <wp:extent cx="5760720" cy="3240405"/>
-            <wp:docPr id="8" name="Picture 8"/>
+            <wp:docPr id="9" name="Picture 9"/>
             <wp:cNvGraphicFramePr>
               <a:graphicFrameLocks noChangeAspect="1"/>
             </wp:cNvGraphicFramePr>
@@ -21777,7 +22905,7 @@
               <a:graphicData uri="http://schemas.openxmlformats.org/drawingml/2006/picture">
                 <pic:pic>
                   <pic:nvPicPr>
-                    <pic:cNvPr id="0" name="08_reports_boardpack.png"/>
+                    <pic:cNvPr id="0" name="09_activity_audit_log.png"/>
                     <pic:cNvPicPr/>
                   </pic:nvPicPr>
                   <pic:blipFill>
@@ -21811,1134 +22939,6 @@
           <w:color w:val="6C757D"/>
           <w:sz w:val="18"/>
         </w:rPr>
-        <w:t>Figure 14.1 — Reports &amp; Board Packs: export builder, preview panel, workbook sheet map</w:t>
-      </w:r>
-    </w:p>
-    <w:p>
-      <w:pPr>
-        <w:pStyle w:val="Heading2"/>
-        <w:spacing w:before="360" w:after="120"/>
-      </w:pPr>
-      <w:r>
-        <w:rPr>
-          <w:color w:val="1E9ED5"/>
-        </w:rPr>
-        <w:t>14.1  Executive Board Pack — Generation Workflow</w:t>
-      </w:r>
-    </w:p>
-    <w:p>
-      <w:pPr>
-        <w:spacing w:before="0" w:after="120"/>
-      </w:pPr>
-      <w:r>
-        <w:rPr>
-          <w:sz w:val="21"/>
-        </w:rPr>
-        <w:t>The Board Pack is assembled programmatically from live P.cache data:</w:t>
-      </w:r>
-    </w:p>
-    <w:p>
-      <w:pPr>
-        <w:pStyle w:val="ListNumber"/>
-        <w:spacing w:before="0" w:after="60"/>
-      </w:pPr>
-      <w:r>
-        <w:rPr>
-          <w:sz w:val="21"/>
-        </w:rPr>
-        <w:t>Project Summary Narrative: auto-generated paragraph from health signals, milestone status, and top risks.</w:t>
-      </w:r>
-    </w:p>
-    <w:p>
-      <w:pPr>
-        <w:pStyle w:val="ListNumber"/>
-        <w:spacing w:before="0" w:after="60"/>
-      </w:pPr>
-      <w:r>
-        <w:rPr>
-          <w:sz w:val="21"/>
-        </w:rPr>
-        <w:t>Health Trend Sparkline: 8-week history of Health Index from P.cache.velocityHistory.</w:t>
-      </w:r>
-    </w:p>
-    <w:p>
-      <w:pPr>
-        <w:pStyle w:val="ListNumber"/>
-        <w:spacing w:before="0" w:after="60"/>
-      </w:pPr>
-      <w:r>
-        <w:rPr>
-          <w:sz w:val="21"/>
-        </w:rPr>
-        <w:t>Critical Path Tasks: all tasks on the critical path within 5 days of or past their due date.</w:t>
-      </w:r>
-    </w:p>
-    <w:p>
-      <w:pPr>
-        <w:pStyle w:val="ListNumber"/>
-        <w:spacing w:before="0" w:after="60"/>
-      </w:pPr>
-      <w:r>
-        <w:rPr>
-          <w:sz w:val="21"/>
-        </w:rPr>
-        <w:t>Top 5 RAID Items: RAID items ranked by exposureScore descending, with owner and mitigation summary.</w:t>
-      </w:r>
-    </w:p>
-    <w:p>
-      <w:pPr>
-        <w:pStyle w:val="ListNumber"/>
-        <w:spacing w:before="0" w:after="60"/>
-      </w:pPr>
-      <w:r>
-        <w:rPr>
-          <w:sz w:val="21"/>
-        </w:rPr>
-        <w:t>Team Velocity: 4-week rolling average from P.cache.velocityHistory.</w:t>
-      </w:r>
-    </w:p>
-    <w:p/>
-    <w:p>
-      <w:pPr>
-        <w:pStyle w:val="Heading2"/>
-        <w:spacing w:before="360" w:after="120"/>
-      </w:pPr>
-      <w:r>
-        <w:rPr>
-          <w:color w:val="1E9ED5"/>
-        </w:rPr>
-        <w:t>14.2  Excel Workbook Architecture — 8 Sheets</w:t>
-      </w:r>
-    </w:p>
-    <w:tbl>
-      <w:tblPr>
-        <w:tblStyle w:val="TableGrid"/>
-        <w:tblW w:type="auto" w:w="0"/>
-        <w:jc w:val="center"/>
-        <w:tblLook w:firstColumn="1" w:firstRow="1" w:lastColumn="0" w:lastRow="0" w:noHBand="0" w:noVBand="1" w:val="04A0"/>
-      </w:tblPr>
-      <w:tblGrid>
-        <w:gridCol w:w="3024"/>
-        <w:gridCol w:w="3024"/>
-        <w:gridCol w:w="3024"/>
-      </w:tblGrid>
-      <w:tr>
-        <w:tc>
-          <w:tcPr>
-            <w:tcW w:type="dxa" w:w="2160"/>
-            <w:shd w:val="clear" w:color="auto" w:fill="0D1B2A"/>
-          </w:tcPr>
-          <w:p>
-            <w:pPr>
-              <w:jc w:val="center"/>
-            </w:pPr>
-            <w:r>
-              <w:rPr>
-                <w:b/>
-                <w:color w:val="FFFFFF"/>
-                <w:sz w:val="19"/>
-              </w:rPr>
-              <w:t>Sheet</w:t>
-            </w:r>
-          </w:p>
-        </w:tc>
-        <w:tc>
-          <w:tcPr>
-            <w:tcW w:type="dxa" w:w="5040"/>
-            <w:shd w:val="clear" w:color="auto" w:fill="0D1B2A"/>
-          </w:tcPr>
-          <w:p>
-            <w:pPr>
-              <w:jc w:val="center"/>
-            </w:pPr>
-            <w:r>
-              <w:rPr>
-                <w:b/>
-                <w:color w:val="FFFFFF"/>
-                <w:sz w:val="19"/>
-              </w:rPr>
-              <w:t>Contents</w:t>
-            </w:r>
-          </w:p>
-        </w:tc>
-        <w:tc>
-          <w:tcPr>
-            <w:tcW w:type="dxa" w:w="2016"/>
-            <w:shd w:val="clear" w:color="auto" w:fill="0D1B2A"/>
-          </w:tcPr>
-          <w:p>
-            <w:pPr>
-              <w:jc w:val="center"/>
-            </w:pPr>
-            <w:r>
-              <w:rPr>
-                <w:b/>
-                <w:color w:val="FFFFFF"/>
-                <w:sz w:val="19"/>
-              </w:rPr>
-              <w:t>Live Formulas</w:t>
-            </w:r>
-          </w:p>
-        </w:tc>
-      </w:tr>
-      <w:tr>
-        <w:tc>
-          <w:tcPr>
-            <w:tcW w:type="dxa" w:w="2160"/>
-            <w:shd w:val="clear" w:color="auto" w:fill="F8F9FA"/>
-          </w:tcPr>
-          <w:p>
-            <w:pPr>
-              <w:spacing w:before="60" w:after="60"/>
-            </w:pPr>
-            <w:r>
-              <w:rPr>
-                <w:sz w:val="19"/>
-              </w:rPr>
-              <w:t>System State</w:t>
-            </w:r>
-          </w:p>
-        </w:tc>
-        <w:tc>
-          <w:tcPr>
-            <w:tcW w:type="dxa" w:w="5040"/>
-            <w:shd w:val="clear" w:color="auto" w:fill="F8F9FA"/>
-          </w:tcPr>
-          <w:p>
-            <w:pPr>
-              <w:spacing w:before="60" w:after="60"/>
-            </w:pPr>
-            <w:r>
-              <w:rPr>
-                <w:sz w:val="19"/>
-              </w:rPr>
-              <w:t>Project name, description, settings, effort unit, last saved timestamp, file sync path.</w:t>
-            </w:r>
-          </w:p>
-        </w:tc>
-        <w:tc>
-          <w:tcPr>
-            <w:tcW w:type="dxa" w:w="2016"/>
-            <w:shd w:val="clear" w:color="auto" w:fill="F8F9FA"/>
-          </w:tcPr>
-          <w:p>
-            <w:pPr>
-              <w:spacing w:before="60" w:after="60"/>
-            </w:pPr>
-            <w:r>
-              <w:rPr>
-                <w:sz w:val="19"/>
-              </w:rPr>
-              <w:t>No</w:t>
-            </w:r>
-          </w:p>
-        </w:tc>
-      </w:tr>
-      <w:tr>
-        <w:tc>
-          <w:tcPr>
-            <w:tcW w:type="dxa" w:w="2160"/>
-            <w:shd w:val="clear" w:color="auto" w:fill="FFFFFF"/>
-          </w:tcPr>
-          <w:p>
-            <w:pPr>
-              <w:spacing w:before="60" w:after="60"/>
-            </w:pPr>
-            <w:r>
-              <w:rPr>
-                <w:sz w:val="19"/>
-              </w:rPr>
-              <w:t>Tasks</w:t>
-            </w:r>
-          </w:p>
-        </w:tc>
-        <w:tc>
-          <w:tcPr>
-            <w:tcW w:type="dxa" w:w="5040"/>
-            <w:shd w:val="clear" w:color="auto" w:fill="FFFFFF"/>
-          </w:tcPr>
-          <w:p>
-            <w:pPr>
-              <w:spacing w:before="60" w:after="60"/>
-            </w:pPr>
-            <w:r>
-              <w:rPr>
-                <w:sz w:val="19"/>
-              </w:rPr>
-              <w:t>Full task register: all fields, baseline dates, variance calculations, slippage reasons.</w:t>
-            </w:r>
-          </w:p>
-        </w:tc>
-        <w:tc>
-          <w:tcPr>
-            <w:tcW w:type="dxa" w:w="2016"/>
-            <w:shd w:val="clear" w:color="auto" w:fill="FFFFFF"/>
-          </w:tcPr>
-          <w:p>
-            <w:pPr>
-              <w:spacing w:before="60" w:after="60"/>
-            </w:pPr>
-            <w:r>
-              <w:rPr>
-                <w:sz w:val="19"/>
-              </w:rPr>
-              <w:t>Yes (variance)</w:t>
-            </w:r>
-          </w:p>
-        </w:tc>
-      </w:tr>
-      <w:tr>
-        <w:tc>
-          <w:tcPr>
-            <w:tcW w:type="dxa" w:w="2160"/>
-            <w:shd w:val="clear" w:color="auto" w:fill="F8F9FA"/>
-          </w:tcPr>
-          <w:p>
-            <w:pPr>
-              <w:spacing w:before="60" w:after="60"/>
-            </w:pPr>
-            <w:r>
-              <w:rPr>
-                <w:sz w:val="19"/>
-              </w:rPr>
-              <w:t>Team</w:t>
-            </w:r>
-          </w:p>
-        </w:tc>
-        <w:tc>
-          <w:tcPr>
-            <w:tcW w:type="dxa" w:w="5040"/>
-            <w:shd w:val="clear" w:color="auto" w:fill="F8F9FA"/>
-          </w:tcPr>
-          <w:p>
-            <w:pPr>
-              <w:spacing w:before="60" w:after="60"/>
-            </w:pPr>
-            <w:r>
-              <w:rPr>
-                <w:sz w:val="19"/>
-              </w:rPr>
-              <w:t>Member directory: roles, statuses, capacity parameters, leave records.</w:t>
-            </w:r>
-          </w:p>
-        </w:tc>
-        <w:tc>
-          <w:tcPr>
-            <w:tcW w:type="dxa" w:w="2016"/>
-            <w:shd w:val="clear" w:color="auto" w:fill="F8F9FA"/>
-          </w:tcPr>
-          <w:p>
-            <w:pPr>
-              <w:spacing w:before="60" w:after="60"/>
-            </w:pPr>
-            <w:r>
-              <w:rPr>
-                <w:sz w:val="19"/>
-              </w:rPr>
-              <w:t>No</w:t>
-            </w:r>
-          </w:p>
-        </w:tc>
-      </w:tr>
-      <w:tr>
-        <w:tc>
-          <w:tcPr>
-            <w:tcW w:type="dxa" w:w="2160"/>
-            <w:shd w:val="clear" w:color="auto" w:fill="FFFFFF"/>
-          </w:tcPr>
-          <w:p>
-            <w:pPr>
-              <w:spacing w:before="60" w:after="60"/>
-            </w:pPr>
-            <w:r>
-              <w:rPr>
-                <w:sz w:val="19"/>
-              </w:rPr>
-              <w:t>RAID Register</w:t>
-            </w:r>
-          </w:p>
-        </w:tc>
-        <w:tc>
-          <w:tcPr>
-            <w:tcW w:type="dxa" w:w="5040"/>
-            <w:shd w:val="clear" w:color="auto" w:fill="FFFFFF"/>
-          </w:tcPr>
-          <w:p>
-            <w:pPr>
-              <w:spacing w:before="60" w:after="60"/>
-            </w:pPr>
-            <w:r>
-              <w:rPr>
-                <w:sz w:val="19"/>
-              </w:rPr>
-              <w:t>All RAID items: type, exposure score, owner, mitigation, status lifecycle.</w:t>
-            </w:r>
-          </w:p>
-        </w:tc>
-        <w:tc>
-          <w:tcPr>
-            <w:tcW w:type="dxa" w:w="2016"/>
-            <w:shd w:val="clear" w:color="auto" w:fill="FFFFFF"/>
-          </w:tcPr>
-          <w:p>
-            <w:pPr>
-              <w:spacing w:before="60" w:after="60"/>
-            </w:pPr>
-            <w:r>
-              <w:rPr>
-                <w:sz w:val="19"/>
-              </w:rPr>
-              <w:t>Yes (exposure)</w:t>
-            </w:r>
-          </w:p>
-        </w:tc>
-      </w:tr>
-      <w:tr>
-        <w:tc>
-          <w:tcPr>
-            <w:tcW w:type="dxa" w:w="2160"/>
-            <w:shd w:val="clear" w:color="auto" w:fill="F8F9FA"/>
-          </w:tcPr>
-          <w:p>
-            <w:pPr>
-              <w:spacing w:before="60" w:after="60"/>
-            </w:pPr>
-            <w:r>
-              <w:rPr>
-                <w:sz w:val="19"/>
-              </w:rPr>
-              <w:t>Defects</w:t>
-            </w:r>
-          </w:p>
-        </w:tc>
-        <w:tc>
-          <w:tcPr>
-            <w:tcW w:type="dxa" w:w="5040"/>
-            <w:shd w:val="clear" w:color="auto" w:fill="F8F9FA"/>
-          </w:tcPr>
-          <w:p>
-            <w:pPr>
-              <w:spacing w:before="60" w:after="60"/>
-            </w:pPr>
-            <w:r>
-              <w:rPr>
-                <w:sz w:val="19"/>
-              </w:rPr>
-              <w:t>Complete defect log: severity, priority, status, SLA, linked tasks, repro steps.</w:t>
-            </w:r>
-          </w:p>
-        </w:tc>
-        <w:tc>
-          <w:tcPr>
-            <w:tcW w:type="dxa" w:w="2016"/>
-            <w:shd w:val="clear" w:color="auto" w:fill="F8F9FA"/>
-          </w:tcPr>
-          <w:p>
-            <w:pPr>
-              <w:spacing w:before="60" w:after="60"/>
-            </w:pPr>
-            <w:r>
-              <w:rPr>
-                <w:sz w:val="19"/>
-              </w:rPr>
-              <w:t>Yes (SLA)</w:t>
-            </w:r>
-          </w:p>
-        </w:tc>
-      </w:tr>
-      <w:tr>
-        <w:tc>
-          <w:tcPr>
-            <w:tcW w:type="dxa" w:w="2160"/>
-            <w:shd w:val="clear" w:color="auto" w:fill="FFFFFF"/>
-          </w:tcPr>
-          <w:p>
-            <w:pPr>
-              <w:spacing w:before="60" w:after="60"/>
-            </w:pPr>
-            <w:r>
-              <w:rPr>
-                <w:sz w:val="19"/>
-              </w:rPr>
-              <w:t>Activity Log</w:t>
-            </w:r>
-          </w:p>
-        </w:tc>
-        <w:tc>
-          <w:tcPr>
-            <w:tcW w:type="dxa" w:w="5040"/>
-            <w:shd w:val="clear" w:color="auto" w:fill="FFFFFF"/>
-          </w:tcPr>
-          <w:p>
-            <w:pPr>
-              <w:spacing w:before="60" w:after="60"/>
-            </w:pPr>
-            <w:r>
-              <w:rPr>
-                <w:sz w:val="19"/>
-              </w:rPr>
-              <w:t>Last 500 audit log entries: timestamps, users, actions, diff payloads.</w:t>
-            </w:r>
-          </w:p>
-        </w:tc>
-        <w:tc>
-          <w:tcPr>
-            <w:tcW w:type="dxa" w:w="2016"/>
-            <w:shd w:val="clear" w:color="auto" w:fill="FFFFFF"/>
-          </w:tcPr>
-          <w:p>
-            <w:pPr>
-              <w:spacing w:before="60" w:after="60"/>
-            </w:pPr>
-            <w:r>
-              <w:rPr>
-                <w:sz w:val="19"/>
-              </w:rPr>
-              <w:t>No</w:t>
-            </w:r>
-          </w:p>
-        </w:tc>
-      </w:tr>
-      <w:tr>
-        <w:tc>
-          <w:tcPr>
-            <w:tcW w:type="dxa" w:w="2160"/>
-            <w:shd w:val="clear" w:color="auto" w:fill="F8F9FA"/>
-          </w:tcPr>
-          <w:p>
-            <w:pPr>
-              <w:spacing w:before="60" w:after="60"/>
-            </w:pPr>
-            <w:r>
-              <w:rPr>
-                <w:sz w:val="19"/>
-              </w:rPr>
-              <w:t>Baselines</w:t>
-            </w:r>
-          </w:p>
-        </w:tc>
-        <w:tc>
-          <w:tcPr>
-            <w:tcW w:type="dxa" w:w="5040"/>
-            <w:shd w:val="clear" w:color="auto" w:fill="F8F9FA"/>
-          </w:tcPr>
-          <w:p>
-            <w:pPr>
-              <w:spacing w:before="60" w:after="60"/>
-            </w:pPr>
-            <w:r>
-              <w:rPr>
-                <w:sz w:val="19"/>
-              </w:rPr>
-              <w:t>All captured baseline snapshots with per-task variance calculations.</w:t>
-            </w:r>
-          </w:p>
-        </w:tc>
-        <w:tc>
-          <w:tcPr>
-            <w:tcW w:type="dxa" w:w="2016"/>
-            <w:shd w:val="clear" w:color="auto" w:fill="F8F9FA"/>
-          </w:tcPr>
-          <w:p>
-            <w:pPr>
-              <w:spacing w:before="60" w:after="60"/>
-            </w:pPr>
-            <w:r>
-              <w:rPr>
-                <w:sz w:val="19"/>
-              </w:rPr>
-              <w:t>Yes (variance)</w:t>
-            </w:r>
-          </w:p>
-        </w:tc>
-      </w:tr>
-      <w:tr>
-        <w:tc>
-          <w:tcPr>
-            <w:tcW w:type="dxa" w:w="2160"/>
-            <w:shd w:val="clear" w:color="auto" w:fill="FFFFFF"/>
-          </w:tcPr>
-          <w:p>
-            <w:pPr>
-              <w:spacing w:before="60" w:after="60"/>
-            </w:pPr>
-            <w:r>
-              <w:rPr>
-                <w:sz w:val="19"/>
-              </w:rPr>
-              <w:t>Releases</w:t>
-            </w:r>
-          </w:p>
-        </w:tc>
-        <w:tc>
-          <w:tcPr>
-            <w:tcW w:type="dxa" w:w="5040"/>
-            <w:shd w:val="clear" w:color="auto" w:fill="FFFFFF"/>
-          </w:tcPr>
-          <w:p>
-            <w:pPr>
-              <w:spacing w:before="60" w:after="60"/>
-            </w:pPr>
-            <w:r>
-              <w:rPr>
-                <w:sz w:val="19"/>
-              </w:rPr>
-              <w:t>Release version registry with status and target dates.</w:t>
-            </w:r>
-          </w:p>
-        </w:tc>
-        <w:tc>
-          <w:tcPr>
-            <w:tcW w:type="dxa" w:w="2016"/>
-            <w:shd w:val="clear" w:color="auto" w:fill="FFFFFF"/>
-          </w:tcPr>
-          <w:p>
-            <w:pPr>
-              <w:spacing w:before="60" w:after="60"/>
-            </w:pPr>
-            <w:r>
-              <w:rPr>
-                <w:sz w:val="19"/>
-              </w:rPr>
-              <w:t>No</w:t>
-            </w:r>
-          </w:p>
-        </w:tc>
-      </w:tr>
-    </w:tbl>
-    <w:p>
-      <w:pPr>
-        <w:spacing w:after="120"/>
-      </w:pPr>
-    </w:p>
-    <w:p>
-      <w:pPr>
-        <w:pStyle w:val="Heading2"/>
-        <w:spacing w:before="360" w:after="120"/>
-      </w:pPr>
-      <w:r>
-        <w:rPr>
-          <w:color w:val="1E9ED5"/>
-        </w:rPr>
-        <w:t>14.3  Excel Cell Colour Coding Rules</w:t>
-      </w:r>
-    </w:p>
-    <w:tbl>
-      <w:tblPr>
-        <w:tblStyle w:val="TableGrid"/>
-        <w:tblW w:type="auto" w:w="0"/>
-        <w:jc w:val="center"/>
-        <w:tblLook w:firstColumn="1" w:firstRow="1" w:lastColumn="0" w:lastRow="0" w:noHBand="0" w:noVBand="1" w:val="04A0"/>
-      </w:tblPr>
-      <w:tblGrid>
-        <w:gridCol w:w="2268"/>
-        <w:gridCol w:w="2268"/>
-        <w:gridCol w:w="2268"/>
-        <w:gridCol w:w="2268"/>
-      </w:tblGrid>
-      <w:tr>
-        <w:tc>
-          <w:tcPr>
-            <w:tcW w:type="dxa" w:w="1440"/>
-            <w:shd w:val="clear" w:color="auto" w:fill="0D1B2A"/>
-          </w:tcPr>
-          <w:p>
-            <w:pPr>
-              <w:jc w:val="center"/>
-            </w:pPr>
-            <w:r>
-              <w:rPr>
-                <w:b/>
-                <w:color w:val="FFFFFF"/>
-                <w:sz w:val="19"/>
-              </w:rPr>
-              <w:t>Colour</w:t>
-            </w:r>
-          </w:p>
-        </w:tc>
-        <w:tc>
-          <w:tcPr>
-            <w:tcW w:type="dxa" w:w="2160"/>
-            <w:shd w:val="clear" w:color="auto" w:fill="0D1B2A"/>
-          </w:tcPr>
-          <w:p>
-            <w:pPr>
-              <w:jc w:val="center"/>
-            </w:pPr>
-            <w:r>
-              <w:rPr>
-                <w:b/>
-                <w:color w:val="FFFFFF"/>
-                <w:sz w:val="19"/>
-              </w:rPr>
-              <w:t>Background Hex</w:t>
-            </w:r>
-          </w:p>
-        </w:tc>
-        <w:tc>
-          <w:tcPr>
-            <w:tcW w:type="dxa" w:w="1728"/>
-            <w:shd w:val="clear" w:color="auto" w:fill="0D1B2A"/>
-          </w:tcPr>
-          <w:p>
-            <w:pPr>
-              <w:jc w:val="center"/>
-            </w:pPr>
-            <w:r>
-              <w:rPr>
-                <w:b/>
-                <w:color w:val="FFFFFF"/>
-                <w:sz w:val="19"/>
-              </w:rPr>
-              <w:t>Text Hex</w:t>
-            </w:r>
-          </w:p>
-        </w:tc>
-        <w:tc>
-          <w:tcPr>
-            <w:tcW w:type="dxa" w:w="4176"/>
-            <w:shd w:val="clear" w:color="auto" w:fill="0D1B2A"/>
-          </w:tcPr>
-          <w:p>
-            <w:pPr>
-              <w:jc w:val="center"/>
-            </w:pPr>
-            <w:r>
-              <w:rPr>
-                <w:b/>
-                <w:color w:val="FFFFFF"/>
-                <w:sz w:val="19"/>
-              </w:rPr>
-              <w:t>Applied When</w:t>
-            </w:r>
-          </w:p>
-        </w:tc>
-      </w:tr>
-      <w:tr>
-        <w:tc>
-          <w:tcPr>
-            <w:tcW w:type="dxa" w:w="1440"/>
-            <w:shd w:val="clear" w:color="auto" w:fill="F8F9FA"/>
-          </w:tcPr>
-          <w:p>
-            <w:pPr>
-              <w:spacing w:before="60" w:after="60"/>
-            </w:pPr>
-            <w:r>
-              <w:rPr>
-                <w:sz w:val="19"/>
-              </w:rPr>
-              <w:t>Green</w:t>
-            </w:r>
-          </w:p>
-        </w:tc>
-        <w:tc>
-          <w:tcPr>
-            <w:tcW w:type="dxa" w:w="2160"/>
-            <w:shd w:val="clear" w:color="auto" w:fill="F8F9FA"/>
-          </w:tcPr>
-          <w:p>
-            <w:pPr>
-              <w:spacing w:before="60" w:after="60"/>
-            </w:pPr>
-            <w:r>
-              <w:rPr>
-                <w:sz w:val="19"/>
-              </w:rPr>
-              <w:t>#D1E7DD</w:t>
-            </w:r>
-          </w:p>
-        </w:tc>
-        <w:tc>
-          <w:tcPr>
-            <w:tcW w:type="dxa" w:w="1728"/>
-            <w:shd w:val="clear" w:color="auto" w:fill="F8F9FA"/>
-          </w:tcPr>
-          <w:p>
-            <w:pPr>
-              <w:spacing w:before="60" w:after="60"/>
-            </w:pPr>
-            <w:r>
-              <w:rPr>
-                <w:sz w:val="19"/>
-              </w:rPr>
-              <w:t>#0F5132</w:t>
-            </w:r>
-          </w:p>
-        </w:tc>
-        <w:tc>
-          <w:tcPr>
-            <w:tcW w:type="dxa" w:w="4176"/>
-            <w:shd w:val="clear" w:color="auto" w:fill="F8F9FA"/>
-          </w:tcPr>
-          <w:p>
-            <w:pPr>
-              <w:spacing w:before="60" w:after="60"/>
-            </w:pPr>
-            <w:r>
-              <w:rPr>
-                <w:sz w:val="19"/>
-              </w:rPr>
-              <w:t>Status = Completed / Closed / Mitigated / Low RAID exposure.</w:t>
-            </w:r>
-          </w:p>
-        </w:tc>
-      </w:tr>
-      <w:tr>
-        <w:tc>
-          <w:tcPr>
-            <w:tcW w:type="dxa" w:w="1440"/>
-            <w:shd w:val="clear" w:color="auto" w:fill="FFFFFF"/>
-          </w:tcPr>
-          <w:p>
-            <w:pPr>
-              <w:spacing w:before="60" w:after="60"/>
-            </w:pPr>
-            <w:r>
-              <w:rPr>
-                <w:sz w:val="19"/>
-              </w:rPr>
-              <w:t>Yellow</w:t>
-            </w:r>
-          </w:p>
-        </w:tc>
-        <w:tc>
-          <w:tcPr>
-            <w:tcW w:type="dxa" w:w="2160"/>
-            <w:shd w:val="clear" w:color="auto" w:fill="FFFFFF"/>
-          </w:tcPr>
-          <w:p>
-            <w:pPr>
-              <w:spacing w:before="60" w:after="60"/>
-            </w:pPr>
-            <w:r>
-              <w:rPr>
-                <w:sz w:val="19"/>
-              </w:rPr>
-              <w:t>#FFF3CD</w:t>
-            </w:r>
-          </w:p>
-        </w:tc>
-        <w:tc>
-          <w:tcPr>
-            <w:tcW w:type="dxa" w:w="1728"/>
-            <w:shd w:val="clear" w:color="auto" w:fill="FFFFFF"/>
-          </w:tcPr>
-          <w:p>
-            <w:pPr>
-              <w:spacing w:before="60" w:after="60"/>
-            </w:pPr>
-            <w:r>
-              <w:rPr>
-                <w:sz w:val="19"/>
-              </w:rPr>
-              <w:t>#664D03</w:t>
-            </w:r>
-          </w:p>
-        </w:tc>
-        <w:tc>
-          <w:tcPr>
-            <w:tcW w:type="dxa" w:w="4176"/>
-            <w:shd w:val="clear" w:color="auto" w:fill="FFFFFF"/>
-          </w:tcPr>
-          <w:p>
-            <w:pPr>
-              <w:spacing w:before="60" w:after="60"/>
-            </w:pPr>
-            <w:r>
-              <w:rPr>
-                <w:sz w:val="19"/>
-              </w:rPr>
-              <w:t>Status = In Progress / Under Review / Medium risk / Deferred.</w:t>
-            </w:r>
-          </w:p>
-        </w:tc>
-      </w:tr>
-      <w:tr>
-        <w:tc>
-          <w:tcPr>
-            <w:tcW w:type="dxa" w:w="1440"/>
-            <w:shd w:val="clear" w:color="auto" w:fill="F8F9FA"/>
-          </w:tcPr>
-          <w:p>
-            <w:pPr>
-              <w:spacing w:before="60" w:after="60"/>
-            </w:pPr>
-            <w:r>
-              <w:rPr>
-                <w:sz w:val="19"/>
-              </w:rPr>
-              <w:t>Red</w:t>
-            </w:r>
-          </w:p>
-        </w:tc>
-        <w:tc>
-          <w:tcPr>
-            <w:tcW w:type="dxa" w:w="2160"/>
-            <w:shd w:val="clear" w:color="auto" w:fill="F8F9FA"/>
-          </w:tcPr>
-          <w:p>
-            <w:pPr>
-              <w:spacing w:before="60" w:after="60"/>
-            </w:pPr>
-            <w:r>
-              <w:rPr>
-                <w:sz w:val="19"/>
-              </w:rPr>
-              <w:t>#F8D7DA</w:t>
-            </w:r>
-          </w:p>
-        </w:tc>
-        <w:tc>
-          <w:tcPr>
-            <w:tcW w:type="dxa" w:w="1728"/>
-            <w:shd w:val="clear" w:color="auto" w:fill="F8F9FA"/>
-          </w:tcPr>
-          <w:p>
-            <w:pPr>
-              <w:spacing w:before="60" w:after="60"/>
-            </w:pPr>
-            <w:r>
-              <w:rPr>
-                <w:sz w:val="19"/>
-              </w:rPr>
-              <w:t>#842029</w:t>
-            </w:r>
-          </w:p>
-        </w:tc>
-        <w:tc>
-          <w:tcPr>
-            <w:tcW w:type="dxa" w:w="4176"/>
-            <w:shd w:val="clear" w:color="auto" w:fill="F8F9FA"/>
-          </w:tcPr>
-          <w:p>
-            <w:pPr>
-              <w:spacing w:before="60" w:after="60"/>
-            </w:pPr>
-            <w:r>
-              <w:rPr>
-                <w:sz w:val="19"/>
-              </w:rPr>
-              <w:t>Status = Blocked / Overdue / Critical risk / S1-S2 Defect.</w:t>
-            </w:r>
-          </w:p>
-        </w:tc>
-      </w:tr>
-      <w:tr>
-        <w:tc>
-          <w:tcPr>
-            <w:tcW w:type="dxa" w:w="1440"/>
-            <w:shd w:val="clear" w:color="auto" w:fill="FFFFFF"/>
-          </w:tcPr>
-          <w:p>
-            <w:pPr>
-              <w:spacing w:before="60" w:after="60"/>
-            </w:pPr>
-            <w:r>
-              <w:rPr>
-                <w:sz w:val="19"/>
-              </w:rPr>
-              <w:t>Grey</w:t>
-            </w:r>
-          </w:p>
-        </w:tc>
-        <w:tc>
-          <w:tcPr>
-            <w:tcW w:type="dxa" w:w="2160"/>
-            <w:shd w:val="clear" w:color="auto" w:fill="FFFFFF"/>
-          </w:tcPr>
-          <w:p>
-            <w:pPr>
-              <w:spacing w:before="60" w:after="60"/>
-            </w:pPr>
-            <w:r>
-              <w:rPr>
-                <w:sz w:val="19"/>
-              </w:rPr>
-              <w:t>#F8F9FA</w:t>
-            </w:r>
-          </w:p>
-        </w:tc>
-        <w:tc>
-          <w:tcPr>
-            <w:tcW w:type="dxa" w:w="1728"/>
-            <w:shd w:val="clear" w:color="auto" w:fill="FFFFFF"/>
-          </w:tcPr>
-          <w:p>
-            <w:pPr>
-              <w:spacing w:before="60" w:after="60"/>
-            </w:pPr>
-            <w:r>
-              <w:rPr>
-                <w:sz w:val="19"/>
-              </w:rPr>
-              <w:t>#6C757D</w:t>
-            </w:r>
-          </w:p>
-        </w:tc>
-        <w:tc>
-          <w:tcPr>
-            <w:tcW w:type="dxa" w:w="4176"/>
-            <w:shd w:val="clear" w:color="auto" w:fill="FFFFFF"/>
-          </w:tcPr>
-          <w:p>
-            <w:pPr>
-              <w:spacing w:before="60" w:after="60"/>
-            </w:pPr>
-            <w:r>
-              <w:rPr>
-                <w:sz w:val="19"/>
-              </w:rPr>
-              <w:t>Status = Cancelled / Rejected / On Hold / Departed member.</w:t>
-            </w:r>
-          </w:p>
-        </w:tc>
-      </w:tr>
-    </w:tbl>
-    <w:p>
-      <w:pPr>
-        <w:spacing w:after="120"/>
-      </w:pPr>
-    </w:p>
-    <w:tbl>
-      <w:tblPr>
-        <w:tblStyle w:val="TableGrid"/>
-        <w:tblW w:type="auto" w:w="0"/>
-        <w:jc w:val="center"/>
-        <w:tblLook w:firstColumn="1" w:firstRow="1" w:lastColumn="0" w:lastRow="0" w:noHBand="0" w:noVBand="1" w:val="04A0"/>
-      </w:tblPr>
-      <w:tblGrid>
-        <w:gridCol w:w="9072"/>
-      </w:tblGrid>
-      <w:tr>
-        <w:tc>
-          <w:tcPr>
-            <w:tcW w:type="dxa" w:w="9072"/>
-            <w:shd w:val="clear" w:color="auto" w:fill="E9F7EF"/>
-            <w:tcBorders>
-              <w:left w:val="single" w:sz="18" w:color="1E8449"/>
-              <w:top w:val="single" w:sz="4" w:color="FFFFFF"/>
-              <w:right w:val="single" w:sz="4" w:color="FFFFFF"/>
-              <w:bottom w:val="single" w:sz="4" w:color="FFFFFF"/>
-            </w:tcBorders>
-          </w:tcPr>
-          <w:p>
-            <w:pPr>
-              <w:spacing w:before="120" w:after="40"/>
-              <w:ind w:left="144"/>
-            </w:pPr>
-            <w:r>
-              <w:rPr>
-                <w:b/>
-                <w:color w:val="145A32"/>
-                <w:sz w:val="18"/>
-              </w:rPr>
-              <w:t xml:space="preserve">[TIP]  </w:t>
-            </w:r>
-          </w:p>
-          <w:p>
-            <w:pPr>
-              <w:spacing w:before="40" w:after="120"/>
-              <w:ind w:left="144"/>
-            </w:pPr>
-            <w:r>
-              <w:rPr>
-                <w:sz w:val="20"/>
-              </w:rPr>
-              <w:t>Excel cells in the Tasks sheet contain live formulas for Variance Days and Effort Variance. Stakeholders can modify the workbook after export without breaking these calculations.</w:t>
-            </w:r>
-          </w:p>
-        </w:tc>
-      </w:tr>
-    </w:tbl>
-    <w:p/>
-    <w:p>
-      <w:r>
-        <w:br w:type="page"/>
-      </w:r>
-    </w:p>
-    <w:p>
-      <w:pPr>
-        <w:pStyle w:val="Heading1"/>
-        <w:spacing w:before="360" w:after="120"/>
-      </w:pPr>
-      <w:r>
-        <w:rPr>
-          <w:color w:val="0D1B2A"/>
-        </w:rPr>
-        <w:t>15  Audit Log &amp; Activity Streams</w:t>
-      </w:r>
-    </w:p>
-    <w:p>
-      <w:pPr>
-        <w:pBdr>
-          <w:bottom w:val="single" w:sz="6" w:space="1" w:color="00C2A8"/>
-        </w:pBdr>
-        <w:spacing w:before="0" w:after="120"/>
-      </w:pPr>
-    </w:p>
-    <w:p>
-      <w:pPr>
-        <w:spacing w:before="0" w:after="160"/>
-      </w:pPr>
-      <w:r>
-        <w:rPr>
-          <w:sz w:val="21"/>
-        </w:rPr>
-        <w:t>The Audit Log provides a complete, immutable, chronological record of every state mutation in the application. It is append-only and forms the basis for both accountability reporting and session rollback.</w:t>
-      </w:r>
-    </w:p>
-    <w:p>
-      <w:pPr>
-        <w:spacing w:before="160" w:after="0"/>
-        <w:jc w:val="center"/>
-      </w:pPr>
-      <w:r>
-        <w:drawing>
-          <wp:inline xmlns:a="http://schemas.openxmlformats.org/drawingml/2006/main" xmlns:pic="http://schemas.openxmlformats.org/drawingml/2006/picture">
-            <wp:extent cx="5760720" cy="3240405"/>
-            <wp:docPr id="9" name="Picture 9"/>
-            <wp:cNvGraphicFramePr>
-              <a:graphicFrameLocks noChangeAspect="1"/>
-            </wp:cNvGraphicFramePr>
-            <a:graphic>
-              <a:graphicData uri="http://schemas.openxmlformats.org/drawingml/2006/picture">
-                <pic:pic>
-                  <pic:nvPicPr>
-                    <pic:cNvPr id="0" name="09_activity_audit_log.png"/>
-                    <pic:cNvPicPr/>
-                  </pic:nvPicPr>
-                  <pic:blipFill>
-                    <a:blip r:embed="rId18"/>
-                    <a:stretch>
-                      <a:fillRect/>
-                    </a:stretch>
-                  </pic:blipFill>
-                  <pic:spPr>
-                    <a:xfrm>
-                      <a:off x="0" y="0"/>
-                      <a:ext cx="5760720" cy="3240405"/>
-                    </a:xfrm>
-                    <a:prstGeom prst="rect"/>
-                  </pic:spPr>
-                </pic:pic>
-              </a:graphicData>
-            </a:graphic>
-          </wp:inline>
-        </w:drawing>
-      </w:r>
-    </w:p>
-    <w:p>
-      <w:pPr>
-        <w:spacing w:before="80" w:after="280"/>
-        <w:jc w:val="center"/>
-      </w:pPr>
-      <w:r>
-        <w:rPr>
-          <w:i/>
-          <w:color w:val="6C757D"/>
-          <w:sz w:val="18"/>
-        </w:rPr>
         <w:t>Figure 15.1 — Audit Log: chronological activity stream with diff payloads</w:t>
       </w:r>
     </w:p>
@@ -23886,7 +23886,7 @@
                     <pic:cNvPicPr/>
                   </pic:nvPicPr>
                   <pic:blipFill>
-                    <a:blip r:embed="rId19"/>
+                    <a:blip r:embed="rId18"/>
                     <a:stretch>
                       <a:fillRect/>
                     </a:stretch>

</xml_diff>

<commit_message>
docs: embed 10 custom workflow and lifecycle diagrams across PCD, FSD, and UMI docs
</commit_message>
<xml_diff>
--- a/docs/ProjectPulse_Functional_Specification.docx
+++ b/docs/ProjectPulse_Functional_Specification.docx
@@ -3277,6 +3277,83 @@
     </w:p>
     <w:p/>
     <w:p>
+      <w:pPr>
+        <w:pStyle w:val="Heading2"/>
+        <w:spacing w:before="360" w:after="120"/>
+      </w:pPr>
+      <w:r>
+        <w:rPr>
+          <w:color w:val="1E9ED5"/>
+        </w:rPr>
+        <w:t>2.6  Architecture Flow &amp; Persistence Lifecycle</w:t>
+      </w:r>
+    </w:p>
+    <w:p>
+      <w:pPr>
+        <w:spacing w:before="0" w:after="160"/>
+      </w:pPr>
+      <w:r>
+        <w:rPr>
+          <w:sz w:val="21"/>
+        </w:rPr>
+        <w:t>The diagram below illustrates the Client-Side SPA System Architecture &amp; Data Flow, including the UI render pipeline, memory caching layers, localStorage debounced auto-saves, and File System imports/exports.</w:t>
+      </w:r>
+    </w:p>
+    <w:p>
+      <w:pPr>
+        <w:spacing w:before="160" w:after="0"/>
+        <w:jc w:val="center"/>
+      </w:pPr>
+      <w:r>
+        <w:drawing>
+          <wp:inline xmlns:a="http://schemas.openxmlformats.org/drawingml/2006/main" xmlns:pic="http://schemas.openxmlformats.org/drawingml/2006/picture">
+            <wp:extent cx="5760720" cy="3647122"/>
+            <wp:docPr id="1" name="Picture 1"/>
+            <wp:cNvGraphicFramePr>
+              <a:graphicFrameLocks noChangeAspect="1"/>
+            </wp:cNvGraphicFramePr>
+            <a:graphic>
+              <a:graphicData uri="http://schemas.openxmlformats.org/drawingml/2006/picture">
+                <pic:pic>
+                  <pic:nvPicPr>
+                    <pic:cNvPr id="0" name="system_architecture.png"/>
+                    <pic:cNvPicPr/>
+                  </pic:nvPicPr>
+                  <pic:blipFill>
+                    <a:blip r:embed="rId10"/>
+                    <a:stretch>
+                      <a:fillRect/>
+                    </a:stretch>
+                  </pic:blipFill>
+                  <pic:spPr>
+                    <a:xfrm>
+                      <a:off x="0" y="0"/>
+                      <a:ext cx="5760720" cy="3647122"/>
+                    </a:xfrm>
+                    <a:prstGeom prst="rect"/>
+                  </pic:spPr>
+                </pic:pic>
+              </a:graphicData>
+            </a:graphic>
+          </wp:inline>
+        </w:drawing>
+      </w:r>
+    </w:p>
+    <w:p>
+      <w:pPr>
+        <w:spacing w:before="80" w:after="280"/>
+        <w:jc w:val="center"/>
+      </w:pPr>
+      <w:r>
+        <w:rPr>
+          <w:i/>
+          <w:color w:val="6C757D"/>
+          <w:sz w:val="18"/>
+        </w:rPr>
+        <w:t>Figure 2.1 — ProjectPulse Client-Side SPA System Architecture &amp; Data Flow</w:t>
+      </w:r>
+    </w:p>
+    <w:p>
       <w:r>
         <w:br w:type="page"/>
       </w:r>
@@ -11127,7 +11204,7 @@
         <w:drawing>
           <wp:inline xmlns:a="http://schemas.openxmlformats.org/drawingml/2006/main" xmlns:pic="http://schemas.openxmlformats.org/drawingml/2006/picture">
             <wp:extent cx="5760720" cy="3240405"/>
-            <wp:docPr id="1" name="Picture 1"/>
+            <wp:docPr id="2" name="Picture 2"/>
             <wp:cNvGraphicFramePr>
               <a:graphicFrameLocks noChangeAspect="1"/>
             </wp:cNvGraphicFramePr>
@@ -11139,7 +11216,7 @@
                     <pic:cNvPicPr/>
                   </pic:nvPicPr>
                   <pic:blipFill>
-                    <a:blip r:embed="rId10"/>
+                    <a:blip r:embed="rId11"/>
                     <a:stretch>
                       <a:fillRect/>
                     </a:stretch>
@@ -12820,6 +12897,83 @@
     </w:tbl>
     <w:p/>
     <w:p>
+      <w:pPr>
+        <w:pStyle w:val="Heading2"/>
+        <w:spacing w:before="360" w:after="120"/>
+      </w:pPr>
+      <w:r>
+        <w:rPr>
+          <w:color w:val="1E9ED5"/>
+        </w:rPr>
+        <w:t>6.6  What-If Sandbox Simulation Workflow</w:t>
+      </w:r>
+    </w:p>
+    <w:p>
+      <w:pPr>
+        <w:spacing w:before="0" w:after="160"/>
+      </w:pPr>
+      <w:r>
+        <w:rPr>
+          <w:sz w:val="21"/>
+        </w:rPr>
+        <w:t>The diagram below outlines the Sandbox simulation workflow, showing how to activate, model, and either commit or discard changes without impacting your live schedule.</w:t>
+      </w:r>
+    </w:p>
+    <w:p>
+      <w:pPr>
+        <w:spacing w:before="160" w:after="0"/>
+        <w:jc w:val="center"/>
+      </w:pPr>
+      <w:r>
+        <w:drawing>
+          <wp:inline xmlns:a="http://schemas.openxmlformats.org/drawingml/2006/main" xmlns:pic="http://schemas.openxmlformats.org/drawingml/2006/picture">
+            <wp:extent cx="5760720" cy="3180398"/>
+            <wp:docPr id="3" name="Picture 3"/>
+            <wp:cNvGraphicFramePr>
+              <a:graphicFrameLocks noChangeAspect="1"/>
+            </wp:cNvGraphicFramePr>
+            <a:graphic>
+              <a:graphicData uri="http://schemas.openxmlformats.org/drawingml/2006/picture">
+                <pic:pic>
+                  <pic:nvPicPr>
+                    <pic:cNvPr id="0" name="sandbox_workflow.png"/>
+                    <pic:cNvPicPr/>
+                  </pic:nvPicPr>
+                  <pic:blipFill>
+                    <a:blip r:embed="rId12"/>
+                    <a:stretch>
+                      <a:fillRect/>
+                    </a:stretch>
+                  </pic:blipFill>
+                  <pic:spPr>
+                    <a:xfrm>
+                      <a:off x="0" y="0"/>
+                      <a:ext cx="5760720" cy="3180398"/>
+                    </a:xfrm>
+                    <a:prstGeom prst="rect"/>
+                  </pic:spPr>
+                </pic:pic>
+              </a:graphicData>
+            </a:graphic>
+          </wp:inline>
+        </w:drawing>
+      </w:r>
+    </w:p>
+    <w:p>
+      <w:pPr>
+        <w:spacing w:before="80" w:after="280"/>
+        <w:jc w:val="center"/>
+      </w:pPr>
+      <w:r>
+        <w:rPr>
+          <w:i/>
+          <w:color w:val="6C757D"/>
+          <w:sz w:val="18"/>
+        </w:rPr>
+        <w:t>Figure 6.2 — Sandbox Simulation Workflow and State Reversion</w:t>
+      </w:r>
+    </w:p>
+    <w:p>
       <w:r>
         <w:br w:type="page"/>
       </w:r>
@@ -13516,6 +13670,83 @@
       <w:pPr>
         <w:spacing w:after="120"/>
       </w:pPr>
+    </w:p>
+    <w:p>
+      <w:pPr>
+        <w:pStyle w:val="Heading3"/>
+        <w:spacing w:before="360" w:after="120"/>
+      </w:pPr>
+      <w:r>
+        <w:rPr>
+          <w:color w:val="1E9ED5"/>
+        </w:rPr>
+        <w:t>7.1.1  EVM Metrics Curves &amp; Performance Bands</w:t>
+      </w:r>
+    </w:p>
+    <w:p>
+      <w:pPr>
+        <w:spacing w:before="0" w:after="160"/>
+      </w:pPr>
+      <w:r>
+        <w:rPr>
+          <w:sz w:val="21"/>
+        </w:rPr>
+        <w:t>The diagram below displays the standard EVM metrics curves — comparing Planned Value (PV), Earned Value (EV), and Actual Cost (AC) over time. It details the visual performance index bands for schedule and cost performance, highlighting variances.</w:t>
+      </w:r>
+    </w:p>
+    <w:p>
+      <w:pPr>
+        <w:spacing w:before="160" w:after="0"/>
+        <w:jc w:val="center"/>
+      </w:pPr>
+      <w:r>
+        <w:drawing>
+          <wp:inline xmlns:a="http://schemas.openxmlformats.org/drawingml/2006/main" xmlns:pic="http://schemas.openxmlformats.org/drawingml/2006/picture">
+            <wp:extent cx="5760720" cy="3117060"/>
+            <wp:docPr id="4" name="Picture 4"/>
+            <wp:cNvGraphicFramePr>
+              <a:graphicFrameLocks noChangeAspect="1"/>
+            </wp:cNvGraphicFramePr>
+            <a:graphic>
+              <a:graphicData uri="http://schemas.openxmlformats.org/drawingml/2006/picture">
+                <pic:pic>
+                  <pic:nvPicPr>
+                    <pic:cNvPr id="0" name="evm_calculation.png"/>
+                    <pic:cNvPicPr/>
+                  </pic:nvPicPr>
+                  <pic:blipFill>
+                    <a:blip r:embed="rId13"/>
+                    <a:stretch>
+                      <a:fillRect/>
+                    </a:stretch>
+                  </pic:blipFill>
+                  <pic:spPr>
+                    <a:xfrm>
+                      <a:off x="0" y="0"/>
+                      <a:ext cx="5760720" cy="3117060"/>
+                    </a:xfrm>
+                    <a:prstGeom prst="rect"/>
+                  </pic:spPr>
+                </pic:pic>
+              </a:graphicData>
+            </a:graphic>
+          </wp:inline>
+        </w:drawing>
+      </w:r>
+    </w:p>
+    <w:p>
+      <w:pPr>
+        <w:spacing w:before="80" w:after="280"/>
+        <w:jc w:val="center"/>
+      </w:pPr>
+      <w:r>
+        <w:rPr>
+          <w:i/>
+          <w:color w:val="6C757D"/>
+          <w:sz w:val="18"/>
+        </w:rPr>
+        <w:t>Figure 7.1 — EVM Metrics Comparison Curves &amp; Performance Bands</w:t>
+      </w:r>
     </w:p>
     <w:p>
       <w:pPr>
@@ -13851,7 +14082,7 @@
         <w:drawing>
           <wp:inline xmlns:a="http://schemas.openxmlformats.org/drawingml/2006/main" xmlns:pic="http://schemas.openxmlformats.org/drawingml/2006/picture">
             <wp:extent cx="5760720" cy="3240405"/>
-            <wp:docPr id="2" name="Picture 2"/>
+            <wp:docPr id="5" name="Picture 5"/>
             <wp:cNvGraphicFramePr>
               <a:graphicFrameLocks noChangeAspect="1"/>
             </wp:cNvGraphicFramePr>
@@ -13863,7 +14094,7 @@
                     <pic:cNvPicPr/>
                   </pic:nvPicPr>
                   <pic:blipFill>
-                    <a:blip r:embed="rId11"/>
+                    <a:blip r:embed="rId14"/>
                     <a:stretch>
                       <a:fillRect/>
                     </a:stretch>
@@ -15071,6 +15302,83 @@
     </w:p>
     <w:p>
       <w:pPr>
+        <w:pStyle w:val="Heading3"/>
+        <w:spacing w:before="360" w:after="120"/>
+      </w:pPr>
+      <w:r>
+        <w:rPr>
+          <w:color w:val="1E9ED5"/>
+        </w:rPr>
+        <w:t>8.3.1  Task Lifecycle State Machine Transition Diagram</w:t>
+      </w:r>
+    </w:p>
+    <w:p>
+      <w:pPr>
+        <w:spacing w:before="0" w:after="160"/>
+      </w:pPr>
+      <w:r>
+        <w:rPr>
+          <w:sz w:val="21"/>
+        </w:rPr>
+        <w:t>The diagram below outlines the valid status transitions within the ProjectPulse Task Lifecycle, including transition guards, blocked/hold state paths, and re-activation triggers.</w:t>
+      </w:r>
+    </w:p>
+    <w:p>
+      <w:pPr>
+        <w:spacing w:before="160" w:after="0"/>
+        <w:jc w:val="center"/>
+      </w:pPr>
+      <w:r>
+        <w:drawing>
+          <wp:inline xmlns:a="http://schemas.openxmlformats.org/drawingml/2006/main" xmlns:pic="http://schemas.openxmlformats.org/drawingml/2006/picture">
+            <wp:extent cx="5760720" cy="2847022"/>
+            <wp:docPr id="6" name="Picture 6"/>
+            <wp:cNvGraphicFramePr>
+              <a:graphicFrameLocks noChangeAspect="1"/>
+            </wp:cNvGraphicFramePr>
+            <a:graphic>
+              <a:graphicData uri="http://schemas.openxmlformats.org/drawingml/2006/picture">
+                <pic:pic>
+                  <pic:nvPicPr>
+                    <pic:cNvPr id="0" name="task_lifecycle.png"/>
+                    <pic:cNvPicPr/>
+                  </pic:nvPicPr>
+                  <pic:blipFill>
+                    <a:blip r:embed="rId15"/>
+                    <a:stretch>
+                      <a:fillRect/>
+                    </a:stretch>
+                  </pic:blipFill>
+                  <pic:spPr>
+                    <a:xfrm>
+                      <a:off x="0" y="0"/>
+                      <a:ext cx="5760720" cy="2847022"/>
+                    </a:xfrm>
+                    <a:prstGeom prst="rect"/>
+                  </pic:spPr>
+                </pic:pic>
+              </a:graphicData>
+            </a:graphic>
+          </wp:inline>
+        </w:drawing>
+      </w:r>
+    </w:p>
+    <w:p>
+      <w:pPr>
+        <w:spacing w:before="80" w:after="280"/>
+        <w:jc w:val="center"/>
+      </w:pPr>
+      <w:r>
+        <w:rPr>
+          <w:i/>
+          <w:color w:val="6C757D"/>
+          <w:sz w:val="18"/>
+        </w:rPr>
+        <w:t>Figure 8.2 — Task State Machine &amp; Transition Paths</w:t>
+      </w:r>
+    </w:p>
+    <w:p>
+      <w:pPr>
         <w:pStyle w:val="Heading2"/>
         <w:spacing w:before="360" w:after="120"/>
       </w:pPr>
@@ -15315,7 +15623,7 @@
         <w:drawing>
           <wp:inline xmlns:a="http://schemas.openxmlformats.org/drawingml/2006/main" xmlns:pic="http://schemas.openxmlformats.org/drawingml/2006/picture">
             <wp:extent cx="5760720" cy="3240405"/>
-            <wp:docPr id="3" name="Picture 3"/>
+            <wp:docPr id="7" name="Picture 7"/>
             <wp:cNvGraphicFramePr>
               <a:graphicFrameLocks noChangeAspect="1"/>
             </wp:cNvGraphicFramePr>
@@ -15327,7 +15635,7 @@
                     <pic:cNvPicPr/>
                   </pic:nvPicPr>
                   <pic:blipFill>
-                    <a:blip r:embed="rId12"/>
+                    <a:blip r:embed="rId16"/>
                     <a:stretch>
                       <a:fillRect/>
                     </a:stretch>
@@ -15806,6 +16114,83 @@
     </w:p>
     <w:p>
       <w:pPr>
+        <w:pStyle w:val="Heading3"/>
+        <w:spacing w:before="360" w:after="120"/>
+      </w:pPr>
+      <w:r>
+        <w:rPr>
+          <w:color w:val="1E9ED5"/>
+        </w:rPr>
+        <w:t>9.2.1  Gantt Dependency Flow &amp; Date Cascade Cascade</w:t>
+      </w:r>
+    </w:p>
+    <w:p>
+      <w:pPr>
+        <w:spacing w:before="0" w:after="160"/>
+      </w:pPr>
+      <w:r>
+        <w:rPr>
+          <w:sz w:val="21"/>
+        </w:rPr>
+        <w:t>The diagram below displays the Gantt Bezier dependency linking mechanism, showing predecessor-to-successor date cascades, visual highlighting of violated dates, and downstream rescheduling propagation.</w:t>
+      </w:r>
+    </w:p>
+    <w:p>
+      <w:pPr>
+        <w:spacing w:before="160" w:after="0"/>
+        <w:jc w:val="center"/>
+      </w:pPr>
+      <w:r>
+        <w:drawing>
+          <wp:inline xmlns:a="http://schemas.openxmlformats.org/drawingml/2006/main" xmlns:pic="http://schemas.openxmlformats.org/drawingml/2006/picture">
+            <wp:extent cx="5760720" cy="3180398"/>
+            <wp:docPr id="8" name="Picture 8"/>
+            <wp:cNvGraphicFramePr>
+              <a:graphicFrameLocks noChangeAspect="1"/>
+            </wp:cNvGraphicFramePr>
+            <a:graphic>
+              <a:graphicData uri="http://schemas.openxmlformats.org/drawingml/2006/picture">
+                <pic:pic>
+                  <pic:nvPicPr>
+                    <pic:cNvPr id="0" name="gantt_dependencies.png"/>
+                    <pic:cNvPicPr/>
+                  </pic:nvPicPr>
+                  <pic:blipFill>
+                    <a:blip r:embed="rId17"/>
+                    <a:stretch>
+                      <a:fillRect/>
+                    </a:stretch>
+                  </pic:blipFill>
+                  <pic:spPr>
+                    <a:xfrm>
+                      <a:off x="0" y="0"/>
+                      <a:ext cx="5760720" cy="3180398"/>
+                    </a:xfrm>
+                    <a:prstGeom prst="rect"/>
+                  </pic:spPr>
+                </pic:pic>
+              </a:graphicData>
+            </a:graphic>
+          </wp:inline>
+        </w:drawing>
+      </w:r>
+    </w:p>
+    <w:p>
+      <w:pPr>
+        <w:spacing w:before="80" w:after="280"/>
+        <w:jc w:val="center"/>
+      </w:pPr>
+      <w:r>
+        <w:rPr>
+          <w:i/>
+          <w:color w:val="6C757D"/>
+          <w:sz w:val="18"/>
+        </w:rPr>
+        <w:t>Figure 9.2 — Gantt Dependency Linkage and Cascading Reschedule Flow</w:t>
+      </w:r>
+    </w:p>
+    <w:p>
+      <w:pPr>
         <w:pStyle w:val="Heading2"/>
         <w:spacing w:before="360" w:after="120"/>
       </w:pPr>
@@ -15984,7 +16369,7 @@
         <w:drawing>
           <wp:inline xmlns:a="http://schemas.openxmlformats.org/drawingml/2006/main" xmlns:pic="http://schemas.openxmlformats.org/drawingml/2006/picture">
             <wp:extent cx="5760720" cy="3240405"/>
-            <wp:docPr id="4" name="Picture 4"/>
+            <wp:docPr id="9" name="Picture 9"/>
             <wp:cNvGraphicFramePr>
               <a:graphicFrameLocks noChangeAspect="1"/>
             </wp:cNvGraphicFramePr>
@@ -15996,7 +16381,7 @@
                     <pic:cNvPicPr/>
                   </pic:nvPicPr>
                   <pic:blipFill>
-                    <a:blip r:embed="rId13"/>
+                    <a:blip r:embed="rId18"/>
                     <a:stretch>
                       <a:fillRect/>
                     </a:stretch>
@@ -17300,6 +17685,83 @@
     <w:p/>
     <w:p>
       <w:pPr>
+        <w:pStyle w:val="Heading3"/>
+        <w:spacing w:before="360" w:after="120"/>
+      </w:pPr>
+      <w:r>
+        <w:rPr>
+          <w:color w:val="1E9ED5"/>
+        </w:rPr>
+        <w:t>10.5.1  Scheduler Conflict Auto-Resolution Workflow</w:t>
+      </w:r>
+    </w:p>
+    <w:p>
+      <w:pPr>
+        <w:spacing w:before="0" w:after="160"/>
+      </w:pPr>
+      <w:r>
+        <w:rPr>
+          <w:sz w:val="21"/>
+        </w:rPr>
+        <w:t>The diagram below outlines the auto-resolution loop executed by the Scheduler's Copilot, illustrating how capacity conflicts are diagnosed and resolved using the auto-sequence, smart reassignment, and cascading shift heuristics.</w:t>
+      </w:r>
+    </w:p>
+    <w:p>
+      <w:pPr>
+        <w:spacing w:before="160" w:after="0"/>
+        <w:jc w:val="center"/>
+      </w:pPr>
+      <w:r>
+        <w:drawing>
+          <wp:inline xmlns:a="http://schemas.openxmlformats.org/drawingml/2006/main" xmlns:pic="http://schemas.openxmlformats.org/drawingml/2006/picture">
+            <wp:extent cx="5760720" cy="3180398"/>
+            <wp:docPr id="10" name="Picture 10"/>
+            <wp:cNvGraphicFramePr>
+              <a:graphicFrameLocks noChangeAspect="1"/>
+            </wp:cNvGraphicFramePr>
+            <a:graphic>
+              <a:graphicData uri="http://schemas.openxmlformats.org/drawingml/2006/picture">
+                <pic:pic>
+                  <pic:nvPicPr>
+                    <pic:cNvPr id="0" name="scheduler_workflow.png"/>
+                    <pic:cNvPicPr/>
+                  </pic:nvPicPr>
+                  <pic:blipFill>
+                    <a:blip r:embed="rId19"/>
+                    <a:stretch>
+                      <a:fillRect/>
+                    </a:stretch>
+                  </pic:blipFill>
+                  <pic:spPr>
+                    <a:xfrm>
+                      <a:off x="0" y="0"/>
+                      <a:ext cx="5760720" cy="3180398"/>
+                    </a:xfrm>
+                    <a:prstGeom prst="rect"/>
+                  </pic:spPr>
+                </pic:pic>
+              </a:graphicData>
+            </a:graphic>
+          </wp:inline>
+        </w:drawing>
+      </w:r>
+    </w:p>
+    <w:p>
+      <w:pPr>
+        <w:spacing w:before="80" w:after="280"/>
+        <w:jc w:val="center"/>
+      </w:pPr>
+      <w:r>
+        <w:rPr>
+          <w:i/>
+          <w:color w:val="6C757D"/>
+          <w:sz w:val="18"/>
+        </w:rPr>
+        <w:t>Figure 10.2 — Copilot Auto-Resolution Decision Path &amp; Heuristics Loop</w:t>
+      </w:r>
+    </w:p>
+    <w:p>
+      <w:pPr>
         <w:pStyle w:val="Heading2"/>
         <w:spacing w:before="360" w:after="120"/>
       </w:pPr>
@@ -17872,7 +18334,7 @@
         <w:drawing>
           <wp:inline xmlns:a="http://schemas.openxmlformats.org/drawingml/2006/main" xmlns:pic="http://schemas.openxmlformats.org/drawingml/2006/picture">
             <wp:extent cx="5760720" cy="3240405"/>
-            <wp:docPr id="5" name="Picture 5"/>
+            <wp:docPr id="11" name="Picture 11"/>
             <wp:cNvGraphicFramePr>
               <a:graphicFrameLocks noChangeAspect="1"/>
             </wp:cNvGraphicFramePr>
@@ -17884,7 +18346,7 @@
                     <pic:cNvPicPr/>
                   </pic:nvPicPr>
                   <pic:blipFill>
-                    <a:blip r:embed="rId13"/>
+                    <a:blip r:embed="rId18"/>
                     <a:stretch>
                       <a:fillRect/>
                     </a:stretch>
@@ -19620,6 +20082,83 @@
     </w:p>
     <w:p>
       <w:pPr>
+        <w:pStyle w:val="Heading3"/>
+        <w:spacing w:before="360" w:after="120"/>
+      </w:pPr>
+      <w:r>
+        <w:rPr>
+          <w:color w:val="1E9ED5"/>
+        </w:rPr>
+        <w:t>11.3.1  RAID Threat Evaluation &amp; Mitigation Workflow</w:t>
+      </w:r>
+    </w:p>
+    <w:p>
+      <w:pPr>
+        <w:spacing w:before="0" w:after="160"/>
+      </w:pPr>
+      <w:r>
+        <w:rPr>
+          <w:sz w:val="21"/>
+        </w:rPr>
+        <w:t>The diagram below outlines the complete RAID governance lifecycle, illustrating risk discovery, 5x5 scoring assessment, owner assignment, mitigation monitoring, and resolution closure.</w:t>
+      </w:r>
+    </w:p>
+    <w:p>
+      <w:pPr>
+        <w:spacing w:before="160" w:after="0"/>
+        <w:jc w:val="center"/>
+      </w:pPr>
+      <w:r>
+        <w:drawing>
+          <wp:inline xmlns:a="http://schemas.openxmlformats.org/drawingml/2006/main" xmlns:pic="http://schemas.openxmlformats.org/drawingml/2006/picture">
+            <wp:extent cx="5760720" cy="3180398"/>
+            <wp:docPr id="12" name="Picture 12"/>
+            <wp:cNvGraphicFramePr>
+              <a:graphicFrameLocks noChangeAspect="1"/>
+            </wp:cNvGraphicFramePr>
+            <a:graphic>
+              <a:graphicData uri="http://schemas.openxmlformats.org/drawingml/2006/picture">
+                <pic:pic>
+                  <pic:nvPicPr>
+                    <pic:cNvPr id="0" name="raid_lifecycle.png"/>
+                    <pic:cNvPicPr/>
+                  </pic:nvPicPr>
+                  <pic:blipFill>
+                    <a:blip r:embed="rId20"/>
+                    <a:stretch>
+                      <a:fillRect/>
+                    </a:stretch>
+                  </pic:blipFill>
+                  <pic:spPr>
+                    <a:xfrm>
+                      <a:off x="0" y="0"/>
+                      <a:ext cx="5760720" cy="3180398"/>
+                    </a:xfrm>
+                    <a:prstGeom prst="rect"/>
+                  </pic:spPr>
+                </pic:pic>
+              </a:graphicData>
+            </a:graphic>
+          </wp:inline>
+        </w:drawing>
+      </w:r>
+    </w:p>
+    <w:p>
+      <w:pPr>
+        <w:spacing w:before="80" w:after="280"/>
+        <w:jc w:val="center"/>
+      </w:pPr>
+      <w:r>
+        <w:rPr>
+          <w:i/>
+          <w:color w:val="6C757D"/>
+          <w:sz w:val="18"/>
+        </w:rPr>
+        <w:t>Figure 11.2 — RAID Threat Assessment &amp; Resolution Process</w:t>
+      </w:r>
+    </w:p>
+    <w:p>
+      <w:pPr>
         <w:pStyle w:val="Heading2"/>
         <w:spacing w:before="360" w:after="120"/>
       </w:pPr>
@@ -19753,7 +20292,7 @@
         <w:drawing>
           <wp:inline xmlns:a="http://schemas.openxmlformats.org/drawingml/2006/main" xmlns:pic="http://schemas.openxmlformats.org/drawingml/2006/picture">
             <wp:extent cx="5760720" cy="3240405"/>
-            <wp:docPr id="6" name="Picture 6"/>
+            <wp:docPr id="13" name="Picture 13"/>
             <wp:cNvGraphicFramePr>
               <a:graphicFrameLocks noChangeAspect="1"/>
             </wp:cNvGraphicFramePr>
@@ -19765,7 +20304,7 @@
                     <pic:cNvPicPr/>
                   </pic:nvPicPr>
                   <pic:blipFill>
-                    <a:blip r:embed="rId14"/>
+                    <a:blip r:embed="rId21"/>
                     <a:stretch>
                       <a:fillRect/>
                     </a:stretch>
@@ -20446,7 +20985,7 @@
         <w:drawing>
           <wp:inline xmlns:a="http://schemas.openxmlformats.org/drawingml/2006/main" xmlns:pic="http://schemas.openxmlformats.org/drawingml/2006/picture">
             <wp:extent cx="5760720" cy="3240405"/>
-            <wp:docPr id="7" name="Picture 7"/>
+            <wp:docPr id="14" name="Picture 14"/>
             <wp:cNvGraphicFramePr>
               <a:graphicFrameLocks noChangeAspect="1"/>
             </wp:cNvGraphicFramePr>
@@ -20458,7 +20997,7 @@
                     <pic:cNvPicPr/>
                   </pic:nvPicPr>
                   <pic:blipFill>
-                    <a:blip r:embed="rId15"/>
+                    <a:blip r:embed="rId22"/>
                     <a:stretch>
                       <a:fillRect/>
                     </a:stretch>
@@ -21654,6 +22193,83 @@
     </w:p>
     <w:p>
       <w:pPr>
+        <w:pStyle w:val="Heading3"/>
+        <w:spacing w:before="360" w:after="120"/>
+      </w:pPr>
+      <w:r>
+        <w:rPr>
+          <w:color w:val="1E9ED5"/>
+        </w:rPr>
+        <w:t>13.2.1  Defect Lifecycle &amp; Retest Verification Pipeline</w:t>
+      </w:r>
+    </w:p>
+    <w:p>
+      <w:pPr>
+        <w:spacing w:before="0" w:after="160"/>
+      </w:pPr>
+      <w:r>
+        <w:rPr>
+          <w:sz w:val="21"/>
+        </w:rPr>
+        <w:t>The diagram below outlines the full state machine of the Defect lifecycle, illustrating triage, rejection, dev assignment, fixing, testing/retesting loops, and closure verification.</w:t>
+      </w:r>
+    </w:p>
+    <w:p>
+      <w:pPr>
+        <w:spacing w:before="160" w:after="0"/>
+        <w:jc w:val="center"/>
+      </w:pPr>
+      <w:r>
+        <w:drawing>
+          <wp:inline xmlns:a="http://schemas.openxmlformats.org/drawingml/2006/main" xmlns:pic="http://schemas.openxmlformats.org/drawingml/2006/picture">
+            <wp:extent cx="5760720" cy="2847022"/>
+            <wp:docPr id="15" name="Picture 15"/>
+            <wp:cNvGraphicFramePr>
+              <a:graphicFrameLocks noChangeAspect="1"/>
+            </wp:cNvGraphicFramePr>
+            <a:graphic>
+              <a:graphicData uri="http://schemas.openxmlformats.org/drawingml/2006/picture">
+                <pic:pic>
+                  <pic:nvPicPr>
+                    <pic:cNvPr id="0" name="defect_lifecycle.png"/>
+                    <pic:cNvPicPr/>
+                  </pic:nvPicPr>
+                  <pic:blipFill>
+                    <a:blip r:embed="rId23"/>
+                    <a:stretch>
+                      <a:fillRect/>
+                    </a:stretch>
+                  </pic:blipFill>
+                  <pic:spPr>
+                    <a:xfrm>
+                      <a:off x="0" y="0"/>
+                      <a:ext cx="5760720" cy="2847022"/>
+                    </a:xfrm>
+                    <a:prstGeom prst="rect"/>
+                  </pic:spPr>
+                </pic:pic>
+              </a:graphicData>
+            </a:graphic>
+          </wp:inline>
+        </w:drawing>
+      </w:r>
+    </w:p>
+    <w:p>
+      <w:pPr>
+        <w:spacing w:before="80" w:after="280"/>
+        <w:jc w:val="center"/>
+      </w:pPr>
+      <w:r>
+        <w:rPr>
+          <w:i/>
+          <w:color w:val="6C757D"/>
+          <w:sz w:val="18"/>
+        </w:rPr>
+        <w:t>Figure 13.2 — Defect Lifecycle &amp; Retesting Decision Paths</w:t>
+      </w:r>
+    </w:p>
+    <w:p>
+      <w:pPr>
         <w:pStyle w:val="Heading2"/>
         <w:spacing w:before="360" w:after="120"/>
       </w:pPr>
@@ -21769,7 +22385,7 @@
         <w:drawing>
           <wp:inline xmlns:a="http://schemas.openxmlformats.org/drawingml/2006/main" xmlns:pic="http://schemas.openxmlformats.org/drawingml/2006/picture">
             <wp:extent cx="5760720" cy="3240405"/>
-            <wp:docPr id="8" name="Picture 8"/>
+            <wp:docPr id="16" name="Picture 16"/>
             <wp:cNvGraphicFramePr>
               <a:graphicFrameLocks noChangeAspect="1"/>
             </wp:cNvGraphicFramePr>
@@ -21781,7 +22397,7 @@
                     <pic:cNvPicPr/>
                   </pic:nvPicPr>
                   <pic:blipFill>
-                    <a:blip r:embed="rId16"/>
+                    <a:blip r:embed="rId24"/>
                     <a:stretch>
                       <a:fillRect/>
                     </a:stretch>
@@ -21898,6 +22514,83 @@
       </w:r>
     </w:p>
     <w:p/>
+    <w:p>
+      <w:pPr>
+        <w:pStyle w:val="Heading3"/>
+        <w:spacing w:before="360" w:after="120"/>
+      </w:pPr>
+      <w:r>
+        <w:rPr>
+          <w:color w:val="1E9ED5"/>
+        </w:rPr>
+        <w:t>14.1.1  Report Compilation &amp; Board Pack Compilation Workflow</w:t>
+      </w:r>
+    </w:p>
+    <w:p>
+      <w:pPr>
+        <w:spacing w:before="0" w:after="160"/>
+      </w:pPr>
+      <w:r>
+        <w:rPr>
+          <w:sz w:val="21"/>
+        </w:rPr>
+        <w:t>The diagram below displays the Report Compilation and Board Pack Export Pipeline Flow, detailing how data is gathered from various cache modules, formatted, and exported to PDF/Word or Excel sheets.</w:t>
+      </w:r>
+    </w:p>
+    <w:p>
+      <w:pPr>
+        <w:spacing w:before="160" w:after="0"/>
+        <w:jc w:val="center"/>
+      </w:pPr>
+      <w:r>
+        <w:drawing>
+          <wp:inline xmlns:a="http://schemas.openxmlformats.org/drawingml/2006/main" xmlns:pic="http://schemas.openxmlformats.org/drawingml/2006/picture">
+            <wp:extent cx="5760720" cy="3180398"/>
+            <wp:docPr id="17" name="Picture 17"/>
+            <wp:cNvGraphicFramePr>
+              <a:graphicFrameLocks noChangeAspect="1"/>
+            </wp:cNvGraphicFramePr>
+            <a:graphic>
+              <a:graphicData uri="http://schemas.openxmlformats.org/drawingml/2006/picture">
+                <pic:pic>
+                  <pic:nvPicPr>
+                    <pic:cNvPr id="0" name="report_workflow.png"/>
+                    <pic:cNvPicPr/>
+                  </pic:nvPicPr>
+                  <pic:blipFill>
+                    <a:blip r:embed="rId25"/>
+                    <a:stretch>
+                      <a:fillRect/>
+                    </a:stretch>
+                  </pic:blipFill>
+                  <pic:spPr>
+                    <a:xfrm>
+                      <a:off x="0" y="0"/>
+                      <a:ext cx="5760720" cy="3180398"/>
+                    </a:xfrm>
+                    <a:prstGeom prst="rect"/>
+                  </pic:spPr>
+                </pic:pic>
+              </a:graphicData>
+            </a:graphic>
+          </wp:inline>
+        </w:drawing>
+      </w:r>
+    </w:p>
+    <w:p>
+      <w:pPr>
+        <w:spacing w:before="80" w:after="280"/>
+        <w:jc w:val="center"/>
+      </w:pPr>
+      <w:r>
+        <w:rPr>
+          <w:i/>
+          <w:color w:val="6C757D"/>
+          <w:sz w:val="18"/>
+        </w:rPr>
+        <w:t>Figure 14.2 — Report and Board Pack Generation Pipeline</w:t>
+      </w:r>
+    </w:p>
     <w:p>
       <w:pPr>
         <w:pStyle w:val="Heading2"/>
@@ -22897,7 +23590,7 @@
         <w:drawing>
           <wp:inline xmlns:a="http://schemas.openxmlformats.org/drawingml/2006/main" xmlns:pic="http://schemas.openxmlformats.org/drawingml/2006/picture">
             <wp:extent cx="5760720" cy="3240405"/>
-            <wp:docPr id="9" name="Picture 9"/>
+            <wp:docPr id="18" name="Picture 18"/>
             <wp:cNvGraphicFramePr>
               <a:graphicFrameLocks noChangeAspect="1"/>
             </wp:cNvGraphicFramePr>
@@ -22909,7 +23602,7 @@
                     <pic:cNvPicPr/>
                   </pic:nvPicPr>
                   <pic:blipFill>
-                    <a:blip r:embed="rId17"/>
+                    <a:blip r:embed="rId26"/>
                     <a:stretch>
                       <a:fillRect/>
                     </a:stretch>
@@ -23830,6 +24523,83 @@
     </w:tbl>
     <w:p/>
     <w:p>
+      <w:pPr>
+        <w:pStyle w:val="Heading3"/>
+        <w:spacing w:before="360" w:after="120"/>
+      </w:pPr>
+      <w:r>
+        <w:rPr>
+          <w:color w:val="1E9ED5"/>
+        </w:rPr>
+        <w:t>16.4.1  Schedule Baseline Management &amp; Restoration Loop</w:t>
+      </w:r>
+    </w:p>
+    <w:p>
+      <w:pPr>
+        <w:spacing w:before="0" w:after="160"/>
+      </w:pPr>
+      <w:r>
+        <w:rPr>
+          <w:sz w:val="21"/>
+        </w:rPr>
+        <w:t>The diagram below outlines the schedule baseline capture, variance tracking, and restoration loops. It visualizes how current planned dates compare to baseline snapshots and how they can be reverted safely.</w:t>
+      </w:r>
+    </w:p>
+    <w:p>
+      <w:pPr>
+        <w:spacing w:before="160" w:after="0"/>
+        <w:jc w:val="center"/>
+      </w:pPr>
+      <w:r>
+        <w:drawing>
+          <wp:inline xmlns:a="http://schemas.openxmlformats.org/drawingml/2006/main" xmlns:pic="http://schemas.openxmlformats.org/drawingml/2006/picture">
+            <wp:extent cx="5760720" cy="3180398"/>
+            <wp:docPr id="19" name="Picture 19"/>
+            <wp:cNvGraphicFramePr>
+              <a:graphicFrameLocks noChangeAspect="1"/>
+            </wp:cNvGraphicFramePr>
+            <a:graphic>
+              <a:graphicData uri="http://schemas.openxmlformats.org/drawingml/2006/picture">
+                <pic:pic>
+                  <pic:nvPicPr>
+                    <pic:cNvPr id="0" name="baseline_workflow.png"/>
+                    <pic:cNvPicPr/>
+                  </pic:nvPicPr>
+                  <pic:blipFill>
+                    <a:blip r:embed="rId27"/>
+                    <a:stretch>
+                      <a:fillRect/>
+                    </a:stretch>
+                  </pic:blipFill>
+                  <pic:spPr>
+                    <a:xfrm>
+                      <a:off x="0" y="0"/>
+                      <a:ext cx="5760720" cy="3180398"/>
+                    </a:xfrm>
+                    <a:prstGeom prst="rect"/>
+                  </pic:spPr>
+                </pic:pic>
+              </a:graphicData>
+            </a:graphic>
+          </wp:inline>
+        </w:drawing>
+      </w:r>
+    </w:p>
+    <w:p>
+      <w:pPr>
+        <w:spacing w:before="80" w:after="280"/>
+        <w:jc w:val="center"/>
+      </w:pPr>
+      <w:r>
+        <w:rPr>
+          <w:i/>
+          <w:color w:val="6C757D"/>
+          <w:sz w:val="18"/>
+        </w:rPr>
+        <w:t>Figure 16.1 — Baseline Snapshot Capture and Restoration Workflow</w:t>
+      </w:r>
+    </w:p>
+    <w:p>
       <w:r>
         <w:br w:type="page"/>
       </w:r>
@@ -23874,7 +24644,7 @@
         <w:drawing>
           <wp:inline xmlns:a="http://schemas.openxmlformats.org/drawingml/2006/main" xmlns:pic="http://schemas.openxmlformats.org/drawingml/2006/picture">
             <wp:extent cx="5760720" cy="3240405"/>
-            <wp:docPr id="10" name="Picture 10"/>
+            <wp:docPr id="20" name="Picture 20"/>
             <wp:cNvGraphicFramePr>
               <a:graphicFrameLocks noChangeAspect="1"/>
             </wp:cNvGraphicFramePr>
@@ -23886,7 +24656,7 @@
                     <pic:cNvPicPr/>
                   </pic:nvPicPr>
                   <pic:blipFill>
-                    <a:blip r:embed="rId18"/>
+                    <a:blip r:embed="rId28"/>
                     <a:stretch>
                       <a:fillRect/>
                     </a:stretch>

</xml_diff>